<commit_message>
Fix broken MER form downloads so Word files open with content
Co-authored-by: Cursor <cursoragent@cursor.com>
</commit_message>
<xml_diff>
--- a/StudentDashboard/app/static/uploads/forms/mer-01.docx
+++ b/StudentDashboard/app/static/uploads/forms/mer-01.docx
@@ -1,5 +1,1696 @@
 
-<file path=word/document.xml><w:body><w:tblCellMar><w:top w:w="0" w:type="dxa"/><w:left w:w="108" w:type="dxa"/><w:bottom w:w="0" w:type="dxa"/><w:right w:w="108" w:type="dxa"/></w:tblCellMar></w:tblPrEx><w:trPr><w:trHeight w:val="1082" w:hRule="atLeast"/></w:trPr><w:tc><w:tcPr><w:tcW w:w="2219" w:type="dxa"/></w:tcPr><w:p><w:pPr><w:jc w:val="center"/></w:pPr><w:r><w:drawing><wp:inline distT="0" distB="0" distL="114300" distR="114300"><wp:extent cx="731520" cy="620395"/><wp:effectExtent l="0" t="0" r="0" b="4445"/><wp:docPr id="1" name="Picture 1"/><wp:cNvGraphicFramePr><a:graphicFrameLocks xmlns:a="http://schemas.openxmlformats.org/drawingml/2006/main" noChangeAspect="1"/></wp:cNvGraphicFramePr><a:graphic xmlns:a="http://schemas.openxmlformats.org/drawingml/2006/main"><a:graphicData uri="http://schemas.openxmlformats.org/drawingml/2006/picture"><pic:pic xmlns:pic="http://schemas.openxmlformats.org/drawingml/2006/picture"><pic:nvPicPr><pic:cNvPr id="1" name="Picture 1"/><pic:cNvPicPr><a:picLocks noChangeAspect="1"/></pic:cNvPicPr></pic:nvPicPr><pic:blipFill><a:blip r:embed="rId6"/><a:srcRect t="15191"/><a:stretch><a:fillRect/></a:stretch></pic:blipFill><pic:spPr><a:xfrm><a:off x="0" y="0"/><a:ext cx="731520" cy="620395"/></a:xfrm><a:prstGeom prst="rect"><a:avLst/></a:prstGeom></pic:spPr></pic:pic></a:graphicData></a:graphic></wp:inline></w:drawing></w:r></w:p></w:tc><w:tc><w:tcPr><w:tcW w:w="5495" w:type="dxa"/><w:vAlign w:val="center"/></w:tcPr><w:p><w:pPr><w:jc w:val="center"/></w:pPr><w:r><w:rPr><w:b/><w:sz w:val="26"/><w:szCs w:val="26"/></w:rPr><w:t>Empowering ATL Programme – Karnataka</w:t></w:r><w:r><w:rPr><w:b/><w:sz w:val="26"/><w:szCs w:val="26"/></w:rPr><w:br w:type="textWrapping"/></w:r><w:r><w:rPr><w:b/><w:sz w:val="26"/><w:szCs w:val="26"/></w:rPr><w:t>ATL Monthly Progress Report</w:t></w:r><w:r><w:rPr><w:sz w:val="26"/><w:szCs w:val="26"/></w:rPr><w:br w:type="textWrapping"/></w:r><w:r><w:rPr><w:sz w:val="26"/><w:szCs w:val="26"/></w:rPr><w:t>Form Code: MER-01</w:t></w:r></w:p></w:tc><w:tc><w:tcPr><w:tcW w:w="2969" w:type="dxa"/></w:tcPr><w:p><w:pPr><w:jc w:val="center"/></w:pPr><w:r><w:drawing><wp:inline distT="0" distB="0" distL="114300" distR="114300"><wp:extent cx="606425" cy="601980"/><wp:effectExtent l="0" t="0" r="3175" b="7620"/><wp:docPr id="2" name="Picture 2"/><wp:cNvGraphicFramePr><a:graphicFrameLocks xmlns:a="http://schemas.openxmlformats.org/drawingml/2006/main" noChangeAspect="1"/></wp:cNvGraphicFramePr><a:graphic xmlns:a="http://schemas.openxmlformats.org/drawingml/2006/main"><a:graphicData uri="http://schemas.openxmlformats.org/drawingml/2006/picture"><pic:pic xmlns:pic="http://schemas.openxmlformats.org/drawingml/2006/picture"><pic:nvPicPr><pic:cNvPr id="2" name="Picture 2"/><pic:cNvPicPr><a:picLocks noChangeAspect="1"/></pic:cNvPicPr></pic:nvPicPr><pic:blipFill><a:blip r:embed="rId7"/><a:srcRect t="10637" b="6585"/><a:stretch><a:fillRect/></a:stretch></pic:blipFill><pic:spPr><a:xfrm><a:off x="0" y="0"/><a:ext cx="606425" cy="601980"/></a:xfrm><a:prstGeom prst="rect"><a:avLst/></a:prstGeom></pic:spPr></pic:pic></a:graphicData></a:graphic></wp:inline></w:drawing></w:r></w:p></w:tc></w:tr></w:tbl><w:p><w:pPr><w:jc w:val="center"/><w:rPr><w:b/><w:sz w:val="28"/></w:rPr></w:pPr></w:p><w:tbl><w:tblPr><w:tblStyle w:val="35"/><w:tblW w:w="0" w:type="auto"/><w:jc w:val="center"/><w:tblBorders><w:top w:val="single" w:color="auto" w:sz="4" w:space="0"/><w:left w:val="single" w:color="auto" w:sz="4" w:space="0"/><w:bottom w:val="single" w:color="auto" w:sz="4" w:space="0"/><w:right w:val="single" w:color="auto" w:sz="4" w:space="0"/><w:insideH w:val="single" w:color="auto" w:sz="4" w:space="0"/><w:insideV w:val="single" w:color="auto" w:sz="4" w:space="0"/></w:tblBorders><w:tblLayout w:type="autofit"/><w:tblCellMar><w:top w:w="0" w:type="dxa"/><w:left w:w="108" w:type="dxa"/><w:bottom w:w="0" w:type="dxa"/><w:right w:w="108" w:type="dxa"/></w:tblCellMar></w:tblPr><w:tblGrid><w:gridCol w:w="1235"/><w:gridCol w:w="1282"/><w:gridCol w:w="1635"/><w:gridCol w:w="1279"/><w:gridCol w:w="1281"/><w:gridCol w:w="1376"/><w:gridCol w:w="1309"/><w:gridCol w:w="1285"/><w:gridCol w:w="3"/></w:tblGrid><w:tr><w:tblPrEx><w:tblBorders><w:top w:val="single" w:color="auto" w:sz="4" w:space="0"/><w:left w:val="single" w:color="auto" w:sz="4" w:space="0"/><w:bottom w:val="single" w:color="auto" w:sz="4" w:space="0"/><w:right w:val="single" w:color="auto" w:sz="4" w:space="0"/><w:insideH w:val="single" w:color="auto" w:sz="4" w:space="0"/><w:insideV w:val="single" w:color="auto" w:sz="4" w:space="0"/></w:tblBorders><w:tblCellMar><w:top w:w="0" w:type="dxa"/><w:left w:w="108" w:type="dxa"/><w:bottom w:w="0" w:type="dxa"/><w:right w:w="108" w:type="dxa"/></w:tblCellMar></w:tblPrEx><w:trPr><w:gridAfter w:val="1"/><w:wAfter w:w="3" w:type="dxa"/><w:jc w:val="center"/></w:trPr><w:tc><w:tcPr><w:tcW w:w="2612" w:type="dxa"/><w:gridSpan w:val="2"/></w:tcPr><w:p><w:pPr><w:spacing w:after="0" w:line="240" w:lineRule="auto"/><w:rPr><w:b/><w:bCs/></w:rPr></w:pPr><w:r><w:rPr><w:b/><w:bCs/></w:rPr><w:t>School Name: __________________</w:t></w:r></w:p></w:tc><w:tc><w:tcPr><w:tcW w:w="2840" w:type="dxa"/><w:gridSpan w:val="2"/></w:tcPr><w:p><w:pPr><w:spacing w:after="0" w:line="240" w:lineRule="auto"/><w:rPr><w:b/><w:bCs/></w:rPr></w:pPr><w:r><w:rPr><w:b/><w:bCs/></w:rPr><w:t>ATL ID</w:t></w:r><w:r><w:rPr><w:rFonts w:hint="default"/><w:b/><w:bCs/><w:lang w:val="en-US"/></w:rPr><w:t xml:space="preserve">/ </w:t></w:r><w:r><w:rPr><w:b/><w:bCs/><w:sz w:val="20"/><w:szCs w:val="20"/></w:rPr><w:t>UDISE Code</w:t></w:r><w:r><w:rPr><w:b/><w:bCs/></w:rPr><w:t>: __________________</w:t></w:r></w:p></w:tc><w:tc><w:tcPr><w:tcW w:w="2614" w:type="dxa"/><w:gridSpan w:val="2"/></w:tcPr><w:p><w:pPr><w:spacing w:after="0" w:line="240" w:lineRule="auto"/><w:rPr><w:b/><w:bCs/></w:rPr></w:pPr><w:r><w:rPr><w:b/><w:bCs/></w:rPr><w:t>District: __________________</w:t></w:r></w:p></w:tc><w:tc><w:tcPr><w:tcW w:w="2616" w:type="dxa"/><w:gridSpan w:val="2"/></w:tcPr><w:p><w:pPr><w:spacing w:after="0" w:line="240" w:lineRule="auto"/><w:rPr><w:b/><w:bCs/></w:rPr></w:pPr><w:r><w:rPr><w:b/><w:bCs/></w:rPr><w:t>Month &amp; Year: __________________</w:t></w:r></w:p></w:tc></w:tr><w:tr><w:tblPrEx><w:tblBorders><w:top w:val="single" w:color="auto" w:sz="4" w:space="0"/><w:left w:val="single" w:color="auto" w:sz="4" w:space="0"/><w:bottom w:val="single" w:color="auto" w:sz="4" w:space="0"/><w:right w:val="single" w:color="auto" w:sz="4" w:space="0"/><w:insideH w:val="single" w:color="auto" w:sz="4" w:space="0"/><w:insideV w:val="single" w:color="auto" w:sz="4" w:space="0"/></w:tblBorders><w:tblCellMar><w:top w:w="0" w:type="dxa"/><w:left w:w="108" w:type="dxa"/><w:bottom w:w="0" w:type="dxa"/><w:right w:w="108" w:type="dxa"/></w:tblCellMar></w:tblPrEx><w:trPr><w:gridAfter w:val="1"/><w:wAfter w:w="3" w:type="dxa"/><w:jc w:val="center"/></w:trPr><w:tc><w:tcPr><w:tcW w:w="2612" w:type="dxa"/><w:gridSpan w:val="2"/></w:tcPr><w:p><w:pPr><w:spacing w:after="0" w:line="240" w:lineRule="auto"/><w:rPr><w:b/><w:bCs/></w:rPr></w:pPr><w:r><w:rPr><w:b/><w:bCs/></w:rPr><w:t>Trainer: __________________</w:t></w:r></w:p></w:tc><w:tc><w:tcPr><w:tcW w:w="2840" w:type="dxa"/><w:gridSpan w:val="2"/></w:tcPr><w:p><w:pPr><w:spacing w:after="0" w:line="240" w:lineRule="auto"/><w:rPr><w:b/><w:bCs/></w:rPr></w:pPr><w:r><w:rPr><w:b/><w:bCs/></w:rPr><w:t>Master Trainer: __________________</w:t></w:r></w:p></w:tc><w:tc><w:tcPr><w:tcW w:w="2614" w:type="dxa"/><w:gridSpan w:val="2"/><w:shd w:val="clear"/><w:vAlign w:val="top"/></w:tcPr><w:p><w:pPr><w:rPr><w:rFonts w:asciiTheme="minorHAnsi" w:hAnsiTheme="minorHAnsi" w:eastAsiaTheme="minorEastAsia" w:cstheme="minorBidi"/><w:sz w:val="22"/><w:szCs w:val="22"/><w:lang w:val="en-US" w:eastAsia="en-US" w:bidi="ar-SA"/></w:rPr></w:pPr><w:r><w:rPr><w:b/><w:bCs/><w:sz w:val="20"/><w:szCs w:val="20"/></w:rPr><w:t xml:space="preserve">Head of Institution: </w:t></w:r><w:r><w:rPr><w:color w:val="595959"/><w:sz w:val="20"/><w:szCs w:val="20"/></w:rPr><w:t>____________________</w:t></w:r></w:p></w:tc><w:tc><w:tcPr><w:tcW w:w="2616" w:type="dxa"/><w:gridSpan w:val="2"/></w:tcPr><w:p><w:pPr><w:spacing w:after="0" w:line="240" w:lineRule="auto"/><w:rPr><w:b/><w:bCs/></w:rPr></w:pPr></w:p></w:tc></w:tr><w:tr><w:tblPrEx><w:tblBorders><w:top w:val="single" w:color="auto" w:sz="4" w:space="0"/><w:left w:val="single" w:color="auto" w:sz="4" w:space="0"/><w:bottom w:val="single" w:color="auto" w:sz="4" w:space="0"/><w:right w:val="single" w:color="auto" w:sz="4" w:space="0"/><w:insideH w:val="single" w:color="auto" w:sz="4" w:space="0"/><w:insideV w:val="single" w:color="auto" w:sz="4" w:space="0"/></w:tblBorders><w:tblCellMar><w:top w:w="0" w:type="dxa"/><w:left w:w="108" w:type="dxa"/><w:bottom w:w="0" w:type="dxa"/><w:right w:w="108" w:type="dxa"/></w:tblCellMar></w:tblPrEx><w:tc><w:tcPr><w:tcW w:w="1305" w:type="dxa"/><w:vAlign w:val="center"/></w:tcPr><w:p><w:pPr><w:spacing w:after="0" w:line="240" w:lineRule="auto"/><w:rPr><w:b/><w:bCs/></w:rPr></w:pPr><w:r><w:rPr><w:b/><w:bCs/></w:rPr><w:t>Class</w:t></w:r></w:p></w:tc><w:tc><w:tcPr><w:tcW w:w="1307" w:type="dxa"/><w:vAlign w:val="center"/></w:tcPr><w:p><w:pPr><w:spacing w:after="0" w:line="240" w:lineRule="auto"/><w:rPr><w:b/><w:bCs/></w:rPr></w:pPr><w:r><w:rPr><w:rFonts w:hint="default"/><w:b/><w:bCs/><w:lang w:val="en-US"/></w:rPr><w:t xml:space="preserve">Students </w:t></w:r><w:r><w:rPr><w:b/><w:bCs/></w:rPr><w:t>Enrolled</w:t></w:r></w:p></w:tc><w:tc><w:tcPr><w:tcW w:w="1533" w:type="dxa"/><w:vAlign w:val="center"/></w:tcPr><w:p><w:pPr><w:spacing w:after="0" w:line="240" w:lineRule="auto"/><w:jc w:val="center"/><w:rPr><w:b/><w:bCs/></w:rPr></w:pPr><w:r><w:rPr><w:rFonts w:hint="default"/><w:b/><w:bCs/><w:lang w:val="en-US"/></w:rPr><w:t xml:space="preserve">Avg. </w:t></w:r><w:r><w:rPr><w:b/><w:bCs/></w:rPr><w:t>Attendance %</w:t></w:r></w:p></w:tc><w:tc><w:tcPr><w:tcW w:w="1307" w:type="dxa"/><w:vAlign w:val="center"/></w:tcPr><w:p><w:pPr><w:spacing w:after="0" w:line="240" w:lineRule="auto"/><w:rPr><w:b/><w:bCs/></w:rPr></w:pPr><w:r><w:rPr><w:b/><w:bCs/></w:rPr><w:t>Sessions Planned</w:t></w:r></w:p></w:tc><w:tc><w:tcPr><w:tcW w:w="1309" w:type="dxa"/><w:vAlign w:val="center"/></w:tcPr><w:p><w:pPr><w:spacing w:after="0" w:line="240" w:lineRule="auto"/><w:rPr><w:b/><w:bCs/></w:rPr></w:pPr><w:r><w:rPr><w:rFonts w:hint="default"/><w:b/><w:bCs/><w:lang w:val="en-US"/></w:rPr><w:t xml:space="preserve">Sessions </w:t></w:r><w:r><w:rPr><w:b/><w:bCs/></w:rPr><w:t>Held</w:t></w:r></w:p></w:tc><w:tc><w:tcPr><w:tcW w:w="1306" w:type="dxa"/><w:vAlign w:val="center"/></w:tcPr><w:p><w:pPr><w:spacing w:after="0" w:line="240" w:lineRule="auto"/><w:rPr><w:rFonts w:hint="default"/><w:b/><w:bCs/><w:lang w:val="en-US"/></w:rPr></w:pPr><w:r><w:rPr><w:rFonts w:hint="default"/><w:b/><w:bCs/><w:lang w:val="en-US"/></w:rPr><w:t xml:space="preserve">Curriculum </w:t></w:r><w:r><w:rPr><w:b/><w:bCs/></w:rPr><w:t>Hours</w:t></w:r><w:r><w:rPr><w:rFonts w:hint="default"/><w:b/><w:bCs/><w:lang w:val="en-US"/></w:rPr><w:t xml:space="preserve"> Completed</w:t></w:r></w:p></w:tc><w:tc><w:tcPr><w:tcW w:w="1309" w:type="dxa"/><w:vAlign w:val="center"/></w:tcPr><w:p><w:pPr><w:spacing w:after="0" w:line="240" w:lineRule="auto"/><w:rPr><w:rFonts w:hint="default"/><w:b/><w:bCs/><w:lang w:val="en-US"/></w:rPr></w:pPr><w:r><w:rPr><w:b/><w:bCs/></w:rPr><w:t>Projects</w:t></w:r><w:r><w:rPr><w:rFonts w:hint="default"/><w:b/><w:bCs/><w:lang w:val="en-US"/></w:rPr><w:t xml:space="preserve"> in Progress</w:t></w:r></w:p></w:tc><w:tc><w:tcPr><w:tcW w:w="1309" w:type="dxa"/><w:gridSpan w:val="2"/><w:vAlign w:val="center"/></w:tcPr><w:p><w:pPr><w:spacing w:after="0" w:line="240" w:lineRule="auto"/><w:rPr><w:b/><w:bCs/></w:rPr></w:pPr><w:r><w:rPr><w:b/><w:bCs/></w:rPr><w:t>Remarks</w:t></w:r></w:p></w:tc></w:tr><w:tr><w:tblPrEx><w:tblBorders><w:top w:val="single" w:color="auto" w:sz="4" w:space="0"/><w:left w:val="single" w:color="auto" w:sz="4" w:space="0"/><w:bottom w:val="single" w:color="auto" w:sz="4" w:space="0"/><w:right w:val="single" w:color="auto" w:sz="4" w:space="0"/><w:insideH w:val="single" w:color="auto" w:sz="4" w:space="0"/><w:insideV w:val="single" w:color="auto" w:sz="4" w:space="0"/></w:tblBorders><w:tblCellMar><w:top w:w="0" w:type="dxa"/><w:left w:w="108" w:type="dxa"/><w:bottom w:w="0" w:type="dxa"/><w:right w:w="108" w:type="dxa"/></w:tblCellMar></w:tblPrEx><w:tc><w:tcPr><w:tcW w:w="1305" w:type="dxa"/></w:tcPr><w:p><w:pPr><w:spacing w:after="0" w:line="240" w:lineRule="auto"/></w:pPr></w:p></w:tc><w:tc><w:tcPr><w:tcW w:w="1307" w:type="dxa"/></w:tcPr><w:p><w:pPr><w:spacing w:after="0" w:line="240" w:lineRule="auto"/></w:pPr></w:p></w:tc><w:tc><w:tcPr><w:tcW w:w="1533" w:type="dxa"/></w:tcPr><w:p><w:pPr><w:spacing w:after="0" w:line="240" w:lineRule="auto"/></w:pPr></w:p></w:tc><w:tc><w:tcPr><w:tcW w:w="1307" w:type="dxa"/></w:tcPr><w:p><w:pPr><w:spacing w:after="0" w:line="240" w:lineRule="auto"/></w:pPr></w:p></w:tc><w:tc><w:tcPr><w:tcW w:w="1309" w:type="dxa"/></w:tcPr><w:p><w:pPr><w:spacing w:after="0" w:line="240" w:lineRule="auto"/></w:pPr></w:p></w:tc><w:tc><w:tcPr><w:tcW w:w="1306" w:type="dxa"/></w:tcPr><w:p><w:pPr><w:spacing w:after="0" w:line="240" w:lineRule="auto"/></w:pPr></w:p></w:tc><w:tc><w:tcPr><w:tcW w:w="1309" w:type="dxa"/></w:tcPr><w:p><w:pPr><w:spacing w:after="0" w:line="240" w:lineRule="auto"/></w:pPr></w:p></w:tc><w:tc><w:tcPr><w:tcW w:w="1309" w:type="dxa"/><w:gridSpan w:val="2"/></w:tcPr><w:p><w:pPr><w:spacing w:after="0" w:line="240" w:lineRule="auto"/></w:pPr></w:p></w:tc></w:tr><w:tr><w:tblPrEx><w:tblBorders><w:top w:val="single" w:color="auto" w:sz="4" w:space="0"/><w:left w:val="single" w:color="auto" w:sz="4" w:space="0"/><w:bottom w:val="single" w:color="auto" w:sz="4" w:space="0"/><w:right w:val="single" w:color="auto" w:sz="4" w:space="0"/><w:insideH w:val="single" w:color="auto" w:sz="4" w:space="0"/><w:insideV w:val="single" w:color="auto" w:sz="4" w:space="0"/></w:tblBorders><w:tblCellMar><w:top w:w="0" w:type="dxa"/><w:left w:w="108" w:type="dxa"/><w:bottom w:w="0" w:type="dxa"/><w:right w:w="108" w:type="dxa"/></w:tblCellMar></w:tblPrEx><w:tc><w:tcPr><w:tcW w:w="1305" w:type="dxa"/></w:tcPr><w:p><w:pPr><w:spacing w:after="0" w:line="240" w:lineRule="auto"/></w:pPr></w:p></w:tc><w:tc><w:tcPr><w:tcW w:w="1307" w:type="dxa"/></w:tcPr><w:p><w:pPr><w:spacing w:after="0" w:line="240" w:lineRule="auto"/></w:pPr></w:p></w:tc><w:tc><w:tcPr><w:tcW w:w="1533" w:type="dxa"/></w:tcPr><w:p><w:pPr><w:spacing w:after="0" w:line="240" w:lineRule="auto"/></w:pPr></w:p></w:tc><w:tc><w:tcPr><w:tcW w:w="1307" w:type="dxa"/></w:tcPr><w:p><w:pPr><w:spacing w:after="0" w:line="240" w:lineRule="auto"/></w:pPr></w:p></w:tc><w:tc><w:tcPr><w:tcW w:w="1309" w:type="dxa"/></w:tcPr><w:p><w:pPr><w:spacing w:after="0" w:line="240" w:lineRule="auto"/></w:pPr></w:p></w:tc><w:tc><w:tcPr><w:tcW w:w="1306" w:type="dxa"/></w:tcPr><w:p><w:pPr><w:spacing w:after="0" w:line="240" w:lineRule="auto"/></w:pPr></w:p></w:tc><w:tc><w:tcPr><w:tcW w:w="1309" w:type="dxa"/></w:tcPr><w:p><w:pPr><w:spacing w:after="0" w:line="240" w:lineRule="auto"/></w:pPr></w:p></w:tc><w:tc><w:tcPr><w:tcW w:w="1309" w:type="dxa"/><w:gridSpan w:val="2"/></w:tcPr><w:p><w:pPr><w:spacing w:after="0" w:line="240" w:lineRule="auto"/></w:pPr></w:p></w:tc></w:tr><w:tr><w:tblPrEx><w:tblBorders><w:top w:val="single" w:color="auto" w:sz="4" w:space="0"/><w:left w:val="single" w:color="auto" w:sz="4" w:space="0"/><w:bottom w:val="single" w:color="auto" w:sz="4" w:space="0"/><w:right w:val="single" w:color="auto" w:sz="4" w:space="0"/><w:insideH w:val="single" w:color="auto" w:sz="4" w:space="0"/><w:insideV w:val="single" w:color="auto" w:sz="4" w:space="0"/></w:tblBorders><w:tblCellMar><w:top w:w="0" w:type="dxa"/><w:left w:w="108" w:type="dxa"/><w:bottom w:w="0" w:type="dxa"/><w:right w:w="108" w:type="dxa"/></w:tblCellMar></w:tblPrEx><w:tc><w:tcPr><w:tcW w:w="1305" w:type="dxa"/></w:tcPr><w:p><w:pPr><w:spacing w:after="0" w:line="240" w:lineRule="auto"/></w:pPr></w:p></w:tc><w:tc><w:tcPr><w:tcW w:w="1307" w:type="dxa"/></w:tcPr><w:p><w:pPr><w:spacing w:after="0" w:line="240" w:lineRule="auto"/></w:pPr></w:p></w:tc><w:tc><w:tcPr><w:tcW w:w="1533" w:type="dxa"/></w:tcPr><w:p><w:pPr><w:spacing w:after="0" w:line="240" w:lineRule="auto"/></w:pPr></w:p></w:tc><w:tc><w:tcPr><w:tcW w:w="1307" w:type="dxa"/></w:tcPr><w:p><w:pPr><w:spacing w:after="0" w:line="240" w:lineRule="auto"/></w:pPr></w:p></w:tc><w:tc><w:tcPr><w:tcW w:w="1309" w:type="dxa"/></w:tcPr><w:p><w:pPr><w:spacing w:after="0" w:line="240" w:lineRule="auto"/></w:pPr></w:p></w:tc><w:tc><w:tcPr><w:tcW w:w="1306" w:type="dxa"/></w:tcPr><w:p><w:pPr><w:spacing w:after="0" w:line="240" w:lineRule="auto"/></w:pPr></w:p></w:tc><w:tc><w:tcPr><w:tcW w:w="1309" w:type="dxa"/></w:tcPr><w:p><w:pPr><w:spacing w:after="0" w:line="240" w:lineRule="auto"/></w:pPr></w:p></w:tc><w:tc><w:tcPr><w:tcW w:w="1309" w:type="dxa"/><w:gridSpan w:val="2"/></w:tcPr><w:p><w:pPr><w:spacing w:after="0" w:line="240" w:lineRule="auto"/></w:pPr></w:p></w:tc></w:tr><w:tr><w:tblPrEx><w:tblBorders><w:top w:val="single" w:color="auto" w:sz="4" w:space="0"/><w:left w:val="single" w:color="auto" w:sz="4" w:space="0"/><w:bottom w:val="single" w:color="auto" w:sz="4" w:space="0"/><w:right w:val="single" w:color="auto" w:sz="4" w:space="0"/><w:insideH w:val="single" w:color="auto" w:sz="4" w:space="0"/><w:insideV w:val="single" w:color="auto" w:sz="4" w:space="0"/></w:tblBorders><w:tblCellMar><w:top w:w="0" w:type="dxa"/><w:left w:w="108" w:type="dxa"/><w:bottom w:w="0" w:type="dxa"/><w:right w:w="108" w:type="dxa"/></w:tblCellMar></w:tblPrEx><w:tc><w:tcPr><w:tcW w:w="1305" w:type="dxa"/></w:tcPr><w:p><w:pPr><w:spacing w:after="0" w:line="240" w:lineRule="auto"/></w:pPr></w:p></w:tc><w:tc><w:tcPr><w:tcW w:w="1307" w:type="dxa"/></w:tcPr><w:p><w:pPr><w:spacing w:after="0" w:line="240" w:lineRule="auto"/></w:pPr></w:p></w:tc><w:tc><w:tcPr><w:tcW w:w="1533" w:type="dxa"/></w:tcPr><w:p><w:pPr><w:spacing w:after="0" w:line="240" w:lineRule="auto"/></w:pPr></w:p></w:tc><w:tc><w:tcPr><w:tcW w:w="1307" w:type="dxa"/></w:tcPr><w:p><w:pPr><w:spacing w:after="0" w:line="240" w:lineRule="auto"/></w:pPr></w:p></w:tc><w:tc><w:tcPr><w:tcW w:w="1309" w:type="dxa"/></w:tcPr><w:p><w:pPr><w:spacing w:after="0" w:line="240" w:lineRule="auto"/></w:pPr></w:p></w:tc><w:tc><w:tcPr><w:tcW w:w="1306" w:type="dxa"/></w:tcPr><w:p><w:pPr><w:spacing w:after="0" w:line="240" w:lineRule="auto"/></w:pPr></w:p></w:tc><w:tc><w:tcPr><w:tcW w:w="1309" w:type="dxa"/></w:tcPr><w:p><w:pPr><w:spacing w:after="0" w:line="240" w:lineRule="auto"/></w:pPr></w:p></w:tc><w:tc><w:tcPr><w:tcW w:w="1309" w:type="dxa"/><w:gridSpan w:val="2"/></w:tcPr><w:p><w:pPr><w:spacing w:after="0" w:line="240" w:lineRule="auto"/></w:pPr></w:p></w:tc></w:tr><w:tr><w:tblPrEx><w:tblBorders><w:top w:val="single" w:color="auto" w:sz="4" w:space="0"/><w:left w:val="single" w:color="auto" w:sz="4" w:space="0"/><w:bottom w:val="single" w:color="auto" w:sz="4" w:space="0"/><w:right w:val="single" w:color="auto" w:sz="4" w:space="0"/><w:insideH w:val="single" w:color="auto" w:sz="4" w:space="0"/><w:insideV w:val="single" w:color="auto" w:sz="4" w:space="0"/></w:tblBorders><w:tblCellMar><w:top w:w="0" w:type="dxa"/><w:left w:w="108" w:type="dxa"/><w:bottom w:w="0" w:type="dxa"/><w:right w:w="108" w:type="dxa"/></w:tblCellMar></w:tblPrEx><w:tc><w:tcPr><w:tcW w:w="1305" w:type="dxa"/></w:tcPr><w:p><w:pPr><w:spacing w:after="0" w:line="240" w:lineRule="auto"/></w:pPr></w:p></w:tc><w:tc><w:tcPr><w:tcW w:w="1307" w:type="dxa"/></w:tcPr><w:p><w:pPr><w:spacing w:after="0" w:line="240" w:lineRule="auto"/></w:pPr></w:p></w:tc><w:tc><w:tcPr><w:tcW w:w="1533" w:type="dxa"/></w:tcPr><w:p><w:pPr><w:spacing w:after="0" w:line="240" w:lineRule="auto"/></w:pPr></w:p></w:tc><w:tc><w:tcPr><w:tcW w:w="1307" w:type="dxa"/></w:tcPr><w:p><w:pPr><w:spacing w:after="0" w:line="240" w:lineRule="auto"/></w:pPr></w:p></w:tc><w:tc><w:tcPr><w:tcW w:w="1309" w:type="dxa"/></w:tcPr><w:p><w:pPr><w:spacing w:after="0" w:line="240" w:lineRule="auto"/></w:pPr></w:p></w:tc><w:tc><w:tcPr><w:tcW w:w="1306" w:type="dxa"/></w:tcPr><w:p><w:pPr><w:spacing w:after="0" w:line="240" w:lineRule="auto"/></w:pPr></w:p></w:tc><w:tc><w:tcPr><w:tcW w:w="1309" w:type="dxa"/></w:tcPr><w:p><w:pPr><w:spacing w:after="0" w:line="240" w:lineRule="auto"/></w:pPr></w:p></w:tc><w:tc><w:tcPr><w:tcW w:w="1309" w:type="dxa"/><w:gridSpan w:val="2"/></w:tcPr><w:p><w:pPr><w:spacing w:after="0" w:line="240" w:lineRule="auto"/></w:pPr></w:p></w:tc></w:tr><w:tr><w:tblPrEx><w:tblBorders><w:top w:val="single" w:color="auto" w:sz="4" w:space="0"/><w:left w:val="single" w:color="auto" w:sz="4" w:space="0"/><w:bottom w:val="single" w:color="auto" w:sz="4" w:space="0"/><w:right w:val="single" w:color="auto" w:sz="4" w:space="0"/><w:insideH w:val="single" w:color="auto" w:sz="4" w:space="0"/><w:insideV w:val="single" w:color="auto" w:sz="4" w:space="0"/></w:tblBorders><w:tblCellMar><w:top w:w="0" w:type="dxa"/><w:left w:w="108" w:type="dxa"/><w:bottom w:w="0" w:type="dxa"/><w:right w:w="108" w:type="dxa"/></w:tblCellMar></w:tblPrEx><w:tc><w:tcPr><w:tcW w:w="1305" w:type="dxa"/></w:tcPr><w:p><w:pPr><w:spacing w:after="0" w:line="240" w:lineRule="auto"/></w:pPr></w:p></w:tc><w:tc><w:tcPr><w:tcW w:w="1307" w:type="dxa"/></w:tcPr><w:p><w:pPr><w:spacing w:after="0" w:line="240" w:lineRule="auto"/></w:pPr></w:p></w:tc><w:tc><w:tcPr><w:tcW w:w="1533" w:type="dxa"/></w:tcPr><w:p><w:pPr><w:spacing w:after="0" w:line="240" w:lineRule="auto"/></w:pPr></w:p></w:tc><w:tc><w:tcPr><w:tcW w:w="1307" w:type="dxa"/></w:tcPr><w:p><w:pPr><w:spacing w:after="0" w:line="240" w:lineRule="auto"/></w:pPr></w:p></w:tc><w:tc><w:tcPr><w:tcW w:w="1309" w:type="dxa"/></w:tcPr><w:p><w:pPr><w:spacing w:after="0" w:line="240" w:lineRule="auto"/></w:pPr></w:p></w:tc><w:tc><w:tcPr><w:tcW w:w="1306" w:type="dxa"/></w:tcPr><w:p><w:pPr><w:spacing w:after="0" w:line="240" w:lineRule="auto"/></w:pPr></w:p></w:tc><w:tc><w:tcPr><w:tcW w:w="1309" w:type="dxa"/></w:tcPr><w:p><w:pPr><w:spacing w:after="0" w:line="240" w:lineRule="auto"/></w:pPr></w:p></w:tc><w:tc><w:tcPr><w:tcW w:w="1309" w:type="dxa"/><w:gridSpan w:val="2"/></w:tcPr><w:p><w:pPr><w:spacing w:after="0" w:line="240" w:lineRule="auto"/></w:pPr></w:p></w:tc></w:tr></w:tbl><w:p/><w:p/><w:tbl><w:tblPr><w:tblStyle w:val="12"/><w:tblW w:w="10708" w:type="dxa"/><w:tblInd w:w="-58" w:type="dxa"/><w:tblBorders><w:top w:val="single" w:color="auto" w:sz="4" w:space="0"/><w:left w:val="single" w:color="auto" w:sz="4" w:space="0"/><w:bottom w:val="single" w:color="auto" w:sz="4" w:space="0"/><w:right w:val="single" w:color="auto" w:sz="4" w:space="0"/><w:insideH w:val="single" w:color="auto" w:sz="4" w:space="0"/><w:insideV w:val="single" w:color="auto" w:sz="4" w:space="0"/></w:tblBorders><w:tblLayout w:type="autofit"/><w:tblCellMar><w:top w:w="0" w:type="dxa"/><w:left w:w="10" w:type="dxa"/><w:bottom w:w="0" w:type="dxa"/><w:right w:w="10" w:type="dxa"/></w:tblCellMar></w:tblPr><w:tblGrid><w:gridCol w:w="5465"/><w:gridCol w:w="5243"/></w:tblGrid><w:tr><w:tblPrEx><w:tblBorders><w:top w:val="single" w:color="auto" w:sz="4" w:space="0"/><w:left w:val="single" w:color="auto" w:sz="4" w:space="0"/><w:bottom w:val="single" w:color="auto" w:sz="4" w:space="0"/><w:right w:val="single" w:color="auto" w:sz="4" w:space="0"/><w:insideH w:val="single" w:color="auto" w:sz="4" w:space="0"/><w:insideV w:val="single" w:color="auto" w:sz="4" w:space="0"/></w:tblBorders><w:tblCellMar><w:top w:w="0" w:type="dxa"/><w:left w:w="10" w:type="dxa"/><w:bottom w:w="0" w:type="dxa"/><w:right w:w="10" w:type="dxa"/></w:tblCellMar></w:tblPrEx><w:trPr><w:tblHeader/></w:trPr><w:tc><w:tcPr><w:tcW w:w="5465" w:type="dxa"/><w:shd w:val="clear" w:color="auto" w:fill="D9E2F3"/><w:tcMar><w:top w:w="50" w:type="dxa"/><w:left w:w="80" w:type="dxa"/><w:bottom w:w="50" w:type="dxa"/><w:right w:w="80" w:type="dxa"/></w:tcMar><w:vAlign w:val="center"/></w:tcPr><w:p><w:pPr><w:jc w:val="center"/><w:rPr><w:rFonts w:hint="default"/><w:lang w:val="en-US"/></w:rPr></w:pPr><w:r><w:rPr><w:b/><w:bCs/><w:sz w:val="19"/><w:szCs w:val="19"/></w:rPr><w:t>Key Activities This Month (visits, competitions, ToT, maintenance</w:t></w:r><w:r><w:rPr><w:rFonts w:hint="default"/><w:b/><w:bCs/><w:sz w:val="19"/><w:szCs w:val="19"/><w:lang w:val="en-US"/></w:rPr><w:t>)</w:t></w:r></w:p></w:tc><w:tc><w:tcPr><w:tcW w:w="5243" w:type="dxa"/><w:shd w:val="clear" w:color="auto" w:fill="D9E2F3"/><w:tcMar><w:top w:w="50" w:type="dxa"/><w:left w:w="80" w:type="dxa"/><w:bottom w:w="50" w:type="dxa"/><w:right w:w="80" w:type="dxa"/></w:tcMar><w:vAlign w:val="center"/></w:tcPr><w:p><w:pPr><w:jc w:val="center"/></w:pPr><w:r><w:rPr><w:b/><w:bCs/><w:sz w:val="19"/><w:szCs w:val="19"/></w:rPr><w:t>Issues / Support Required</w:t></w:r></w:p></w:tc></w:tr><w:tr><w:tblPrEx><w:tblBorders><w:top w:val="single" w:color="auto" w:sz="4" w:space="0"/><w:left w:val="single" w:color="auto" w:sz="4" w:space="0"/><w:bottom w:val="single" w:color="auto" w:sz="4" w:space="0"/><w:right w:val="single" w:color="auto" w:sz="4" w:space="0"/><w:insideH w:val="single" w:color="auto" w:sz="4" w:space="0"/><w:insideV w:val="single" w:color="auto" w:sz="4" w:space="0"/></w:tblBorders><w:tblCellMar><w:top w:w="0" w:type="dxa"/><w:left w:w="10" w:type="dxa"/><w:bottom w:w="0" w:type="dxa"/><w:right w:w="10" w:type="dxa"/></w:tblCellMar></w:tblPrEx><w:trPr><w:trHeight w:val="360" w:hRule="atLeast"/></w:trPr><w:tc><w:tcPr><w:tcW w:w="5465" w:type="dxa"/></w:tcPr><w:p/></w:tc><w:tc><w:tcPr><w:tcW w:w="5243" w:type="dxa"/></w:tcPr><w:p/></w:tc></w:tr><w:tr><w:tblPrEx><w:tblBorders><w:top w:val="single" w:color="auto" w:sz="4" w:space="0"/><w:left w:val="single" w:color="auto" w:sz="4" w:space="0"/><w:bottom w:val="single" w:color="auto" w:sz="4" w:space="0"/><w:right w:val="single" w:color="auto" w:sz="4" w:space="0"/><w:insideH w:val="single" w:color="auto" w:sz="4" w:space="0"/><w:insideV w:val="single" w:color="auto" w:sz="4" w:space="0"/></w:tblBorders><w:tblCellMar><w:top w:w="0" w:type="dxa"/><w:left w:w="10" w:type="dxa"/><w:bottom w:w="0" w:type="dxa"/><w:right w:w="10" w:type="dxa"/></w:tblCellMar></w:tblPrEx><w:trPr><w:trHeight w:val="360" w:hRule="atLeast"/></w:trPr><w:tc><w:tcPr><w:tcW w:w="5465" w:type="dxa"/></w:tcPr><w:p/></w:tc><w:tc><w:tcPr><w:tcW w:w="5243" w:type="dxa"/></w:tcPr><w:p/></w:tc></w:tr><w:tr><w:tblPrEx><w:tblBorders><w:top w:val="single" w:color="auto" w:sz="4" w:space="0"/><w:left w:val="single" w:color="auto" w:sz="4" w:space="0"/><w:bottom w:val="single" w:color="auto" w:sz="4" w:space="0"/><w:right w:val="single" w:color="auto" w:sz="4" w:space="0"/><w:insideH w:val="single" w:color="auto" w:sz="4" w:space="0"/><w:insideV w:val="single" w:color="auto" w:sz="4" w:space="0"/></w:tblBorders><w:tblCellMar><w:top w:w="0" w:type="dxa"/><w:left w:w="10" w:type="dxa"/><w:bottom w:w="0" w:type="dxa"/><w:right w:w="10" w:type="dxa"/></w:tblCellMar></w:tblPrEx><w:trPr><w:trHeight w:val="360" w:hRule="atLeast"/></w:trPr><w:tc><w:tcPr><w:tcW w:w="5465" w:type="dxa"/></w:tcPr><w:p/></w:tc><w:tc><w:tcPr><w:tcW w:w="5243" w:type="dxa"/></w:tcPr><w:p/></w:tc></w:tr></w:tbl><w:p><w:pPr><w:spacing w:before="80" w:after="120"/></w:pPr><w:r><w:rPr><w:i/><w:iCs/><w:color w:val="595959"/><w:sz w:val="19"/><w:szCs w:val="19"/></w:rPr><w:t>Note: Attach attested attendance sheets (MER-03) and daily diary extracts. Submit to GTTC PMU by the 5th of the succeeding month.</w:t></w:r></w:p><w:p/><w:tbl><w:tblPr><w:tblStyle w:val="12"/><w:tblW w:w="10645" w:type="dxa"/><w:tblInd w:w="-75" w:type="dxa"/><w:tblLayout w:type="autofit"/><w:tblCellMar><w:top w:w="0" w:type="dxa"/><w:left w:w="10" w:type="dxa"/><w:bottom w:w="0" w:type="dxa"/><w:right w:w="10" w:type="dxa"/></w:tblCellMar></w:tblPr><w:tblGrid><w:gridCol w:w="5410"/><w:gridCol w:w="5235"/></w:tblGrid><w:tr><w:tblPrEx><w:tblCellMar><w:top w:w="0" w:type="dxa"/><w:left w:w="10" w:type="dxa"/><w:bottom w:w="0" w:type="dxa"/><w:right w:w="10" w:type="dxa"/></w:tblCellMar></w:tblPrEx><w:tc><w:tcPr><w:tcW w:w="5410" w:type="dxa"/></w:tcPr><w:p><w:pPr><w:spacing w:before="500"/><w:jc w:val="center"/></w:pPr><w:r><w:rPr><w:sz w:val="20"/><w:szCs w:val="20"/></w:rPr><w:t>____________________________</w:t></w:r></w:p><w:p><w:pPr><w:jc w:val="center"/></w:pPr><w:r><w:rPr><w:b/><w:bCs/><w:sz w:val="20"/><w:szCs w:val="20"/></w:rPr><w:t>ATL Trainer</w:t></w:r></w:p><w:p><w:pPr><w:jc w:val="center"/></w:pPr><w:r><w:rPr><w:color w:val="595959"/><w:sz w:val="18"/><w:szCs w:val="18"/></w:rPr><w:t>Name / Designation / Date &amp; Seal</w:t></w:r></w:p></w:tc><w:tc><w:tcPr><w:tcW w:w="5235" w:type="dxa"/></w:tcPr><w:p><w:pPr><w:spacing w:before="500"/><w:jc w:val="center"/></w:pPr><w:r><w:rPr><w:sz w:val="20"/><w:szCs w:val="20"/></w:rPr><w:t>____________________________</w:t></w:r></w:p><w:p><w:pPr><w:jc w:val="center"/></w:pPr><w:r><w:rPr><w:b/><w:bCs/><w:sz w:val="20"/><w:szCs w:val="20"/></w:rPr><w:t>Head of Institution (Attestation)</w:t></w:r></w:p><w:p><w:pPr><w:jc w:val="center"/></w:pPr><w:r><w:rPr><w:color w:val="595959"/><w:sz w:val="18"/><w:szCs w:val="18"/></w:rPr><w:t>Name / Designation / Date &amp; Seal</w:t></w:r></w:p></w:tc></w:tr></w:tbl><w:p/><w:p><w:r><w:br w:type="page"/></w:r></w:p><w:tbl><w:tblPr><w:tblStyle w:val="12"/><w:tblW w:w="10687" w:type="dxa"/><w:tblInd w:w="0" w:type="dxa"/><w:tblLayout w:type="autofit"/><w:tblCellMar><w:top w:w="0" w:type="dxa"/><w:left w:w="108" w:type="dxa"/><w:bottom w:w="0" w:type="dxa"/><w:right w:w="108" w:type="dxa"/></w:tblCellMar></w:tblPr><w:tblGrid><w:gridCol w:w="2219"/><w:gridCol w:w="5495"/><w:gridCol w:w="2973"/></w:tblGrid><w:tr><w:tblPrEx></w:body>
+<file path=word/document.xml><?xml version="1.0" encoding="utf-8"?>
+<w:document xmlns:a="http://schemas.openxmlformats.org/drawingml/2006/main" xmlns:mc="http://schemas.openxmlformats.org/markup-compatibility/2006" xmlns:pic="http://schemas.openxmlformats.org/drawingml/2006/picture" xmlns:r="http://schemas.openxmlformats.org/officeDocument/2006/relationships" xmlns:w="http://schemas.openxmlformats.org/wordprocessingml/2006/main" xmlns:w14="http://schemas.microsoft.com/office/word/2010/wordml" xmlns:wp="http://schemas.openxmlformats.org/drawingml/2006/wordprocessingDrawing" mc:Ignorable="w14 w15 wp14">
+  <w:body>
+    <w:tbl>
+      <w:tblPr>
+        <w:tblStyle w:val="12"/>
+        <w:tblW w:w="0" w:type="auto"/>
+        <w:tblInd w:w="0" w:type="dxa"/>
+        <w:tblLayout w:type="autofit"/>
+        <w:tblCellMar>
+          <w:top w:w="0" w:type="dxa"/>
+          <w:left w:w="108" w:type="dxa"/>
+          <w:bottom w:w="0" w:type="dxa"/>
+          <w:right w:w="108" w:type="dxa"/>
+        </w:tblCellMar>
+      </w:tblPr>
+      <w:tblGrid>
+        <w:gridCol w:w="2219"/>
+        <w:gridCol w:w="5495"/>
+        <w:gridCol w:w="2969"/>
+      </w:tblGrid>
+      <w:tr>
+        <w:tblPrEx>
+          <w:tblCellMar>
+            <w:top w:w="0" w:type="dxa"/>
+            <w:left w:w="108" w:type="dxa"/>
+            <w:bottom w:w="0" w:type="dxa"/>
+            <w:right w:w="108" w:type="dxa"/>
+          </w:tblCellMar>
+        </w:tblPrEx>
+        <w:trPr>
+          <w:trHeight w:val="1082" w:hRule="atLeast"/>
+        </w:trPr>
+        <w:tc>
+          <w:tcPr>
+            <w:tcW w:w="2219" w:type="dxa"/>
+          </w:tcPr>
+          <w:p>
+            <w:pPr>
+              <w:jc w:val="center"/>
+            </w:pPr>
+            <w:r>
+              <w:drawing>
+                <wp:inline distT="0" distB="0" distL="114300" distR="114300">
+                  <wp:extent cx="731520" cy="620395"/>
+                  <wp:effectExtent l="0" t="0" r="0" b="4445"/>
+                  <wp:docPr id="1" name="Picture 1"/>
+                  <wp:cNvGraphicFramePr>
+                    <a:graphicFrameLocks noChangeAspect="1"/>
+                  </wp:cNvGraphicFramePr>
+                  <a:graphic>
+                    <a:graphicData uri="http://schemas.openxmlformats.org/drawingml/2006/picture">
+                      <pic:pic>
+                        <pic:nvPicPr>
+                          <pic:cNvPr id="1" name="Picture 1"/>
+                          <pic:cNvPicPr>
+                            <a:picLocks noChangeAspect="1"/>
+                          </pic:cNvPicPr>
+                        </pic:nvPicPr>
+                        <pic:blipFill>
+                          <a:blip r:embed="rId6"/>
+                          <a:srcRect t="15191"/>
+                          <a:stretch>
+                            <a:fillRect/>
+                          </a:stretch>
+                        </pic:blipFill>
+                        <pic:spPr>
+                          <a:xfrm>
+                            <a:off x="0" y="0"/>
+                            <a:ext cx="731520" cy="620395"/>
+                          </a:xfrm>
+                          <a:prstGeom prst="rect">
+                            <a:avLst/>
+                          </a:prstGeom>
+                        </pic:spPr>
+                      </pic:pic>
+                    </a:graphicData>
+                  </a:graphic>
+                </wp:inline>
+              </w:drawing>
+            </w:r>
+          </w:p>
+        </w:tc>
+        <w:tc>
+          <w:tcPr>
+            <w:tcW w:w="5495" w:type="dxa"/>
+            <w:vAlign w:val="center"/>
+          </w:tcPr>
+          <w:p>
+            <w:pPr>
+              <w:jc w:val="center"/>
+            </w:pPr>
+            <w:r>
+              <w:rPr>
+                <w:b/>
+                <w:sz w:val="26"/>
+                <w:szCs w:val="26"/>
+              </w:rPr>
+              <w:t>Empowering ATL Programme – Karnataka</w:t>
+            </w:r>
+            <w:r>
+              <w:rPr>
+                <w:b/>
+                <w:sz w:val="26"/>
+                <w:szCs w:val="26"/>
+              </w:rPr>
+              <w:br w:type="textWrapping"/>
+            </w:r>
+            <w:r>
+              <w:rPr>
+                <w:b/>
+                <w:sz w:val="26"/>
+                <w:szCs w:val="26"/>
+              </w:rPr>
+              <w:t>ATL Monthly Progress Report</w:t>
+            </w:r>
+            <w:r>
+              <w:rPr>
+                <w:sz w:val="26"/>
+                <w:szCs w:val="26"/>
+              </w:rPr>
+              <w:br w:type="textWrapping"/>
+            </w:r>
+            <w:r>
+              <w:rPr>
+                <w:sz w:val="26"/>
+                <w:szCs w:val="26"/>
+              </w:rPr>
+              <w:t>Form Code: MER-01</w:t>
+            </w:r>
+          </w:p>
+        </w:tc>
+        <w:tc>
+          <w:tcPr>
+            <w:tcW w:w="2969" w:type="dxa"/>
+          </w:tcPr>
+          <w:p>
+            <w:pPr>
+              <w:jc w:val="center"/>
+            </w:pPr>
+            <w:r>
+              <w:drawing>
+                <wp:inline distT="0" distB="0" distL="114300" distR="114300">
+                  <wp:extent cx="606425" cy="601980"/>
+                  <wp:effectExtent l="0" t="0" r="3175" b="7620"/>
+                  <wp:docPr id="2" name="Picture 2"/>
+                  <wp:cNvGraphicFramePr>
+                    <a:graphicFrameLocks noChangeAspect="1"/>
+                  </wp:cNvGraphicFramePr>
+                  <a:graphic>
+                    <a:graphicData uri="http://schemas.openxmlformats.org/drawingml/2006/picture">
+                      <pic:pic>
+                        <pic:nvPicPr>
+                          <pic:cNvPr id="2" name="Picture 2"/>
+                          <pic:cNvPicPr>
+                            <a:picLocks noChangeAspect="1"/>
+                          </pic:cNvPicPr>
+                        </pic:nvPicPr>
+                        <pic:blipFill>
+                          <a:blip r:embed="rId7"/>
+                          <a:srcRect t="10637" b="6585"/>
+                          <a:stretch>
+                            <a:fillRect/>
+                          </a:stretch>
+                        </pic:blipFill>
+                        <pic:spPr>
+                          <a:xfrm>
+                            <a:off x="0" y="0"/>
+                            <a:ext cx="606425" cy="601980"/>
+                          </a:xfrm>
+                          <a:prstGeom prst="rect">
+                            <a:avLst/>
+                          </a:prstGeom>
+                        </pic:spPr>
+                      </pic:pic>
+                    </a:graphicData>
+                  </a:graphic>
+                </wp:inline>
+              </w:drawing>
+            </w:r>
+          </w:p>
+        </w:tc>
+      </w:tr>
+    </w:tbl>
+    <w:p>
+      <w:pPr>
+        <w:jc w:val="center"/>
+        <w:rPr>
+          <w:b/>
+          <w:sz w:val="28"/>
+        </w:rPr>
+      </w:pPr>
+    </w:p>
+    <w:tbl>
+      <w:tblPr>
+        <w:tblStyle w:val="35"/>
+        <w:tblW w:w="0" w:type="auto"/>
+        <w:jc w:val="center"/>
+        <w:tblBorders>
+          <w:top w:val="single" w:color="auto" w:sz="4" w:space="0"/>
+          <w:left w:val="single" w:color="auto" w:sz="4" w:space="0"/>
+          <w:bottom w:val="single" w:color="auto" w:sz="4" w:space="0"/>
+          <w:right w:val="single" w:color="auto" w:sz="4" w:space="0"/>
+          <w:insideH w:val="single" w:color="auto" w:sz="4" w:space="0"/>
+          <w:insideV w:val="single" w:color="auto" w:sz="4" w:space="0"/>
+        </w:tblBorders>
+        <w:tblLayout w:type="autofit"/>
+        <w:tblCellMar>
+          <w:top w:w="0" w:type="dxa"/>
+          <w:left w:w="108" w:type="dxa"/>
+          <w:bottom w:w="0" w:type="dxa"/>
+          <w:right w:w="108" w:type="dxa"/>
+        </w:tblCellMar>
+      </w:tblPr>
+      <w:tblGrid>
+        <w:gridCol w:w="1235"/>
+        <w:gridCol w:w="1282"/>
+        <w:gridCol w:w="1635"/>
+        <w:gridCol w:w="1279"/>
+        <w:gridCol w:w="1281"/>
+        <w:gridCol w:w="1376"/>
+        <w:gridCol w:w="1309"/>
+        <w:gridCol w:w="1285"/>
+        <w:gridCol w:w="3"/>
+      </w:tblGrid>
+      <w:tr>
+        <w:tblPrEx>
+          <w:tblBorders>
+            <w:top w:val="single" w:color="auto" w:sz="4" w:space="0"/>
+            <w:left w:val="single" w:color="auto" w:sz="4" w:space="0"/>
+            <w:bottom w:val="single" w:color="auto" w:sz="4" w:space="0"/>
+            <w:right w:val="single" w:color="auto" w:sz="4" w:space="0"/>
+            <w:insideH w:val="single" w:color="auto" w:sz="4" w:space="0"/>
+            <w:insideV w:val="single" w:color="auto" w:sz="4" w:space="0"/>
+          </w:tblBorders>
+          <w:tblCellMar>
+            <w:top w:w="0" w:type="dxa"/>
+            <w:left w:w="108" w:type="dxa"/>
+            <w:bottom w:w="0" w:type="dxa"/>
+            <w:right w:w="108" w:type="dxa"/>
+          </w:tblCellMar>
+        </w:tblPrEx>
+        <w:trPr>
+          <w:gridAfter w:val="1"/>
+          <w:wAfter w:w="3" w:type="dxa"/>
+          <w:jc w:val="center"/>
+        </w:trPr>
+        <w:tc>
+          <w:tcPr>
+            <w:tcW w:w="2612" w:type="dxa"/>
+            <w:gridSpan w:val="2"/>
+          </w:tcPr>
+          <w:p>
+            <w:pPr>
+              <w:spacing w:after="0" w:line="240" w:lineRule="auto"/>
+              <w:rPr>
+                <w:b/>
+                <w:bCs/>
+              </w:rPr>
+            </w:pPr>
+            <w:r>
+              <w:rPr>
+                <w:b/>
+                <w:bCs/>
+              </w:rPr>
+              <w:t>School Name: __________________</w:t>
+            </w:r>
+          </w:p>
+        </w:tc>
+        <w:tc>
+          <w:tcPr>
+            <w:tcW w:w="2840" w:type="dxa"/>
+            <w:gridSpan w:val="2"/>
+          </w:tcPr>
+          <w:p>
+            <w:pPr>
+              <w:spacing w:after="0" w:line="240" w:lineRule="auto"/>
+              <w:rPr>
+                <w:b/>
+                <w:bCs/>
+              </w:rPr>
+            </w:pPr>
+            <w:r>
+              <w:rPr>
+                <w:b/>
+                <w:bCs/>
+              </w:rPr>
+              <w:t>ATL ID</w:t>
+            </w:r>
+            <w:r>
+              <w:rPr>
+                <w:rFonts w:hint="default"/>
+                <w:b/>
+                <w:bCs/>
+                <w:lang w:val="en-US"/>
+              </w:rPr>
+              <w:t xml:space="preserve">/ </w:t>
+            </w:r>
+            <w:r>
+              <w:rPr>
+                <w:b/>
+                <w:bCs/>
+                <w:sz w:val="20"/>
+                <w:szCs w:val="20"/>
+              </w:rPr>
+              <w:t>UDISE Code</w:t>
+            </w:r>
+            <w:r>
+              <w:rPr>
+                <w:b/>
+                <w:bCs/>
+              </w:rPr>
+              <w:t>: __________________</w:t>
+            </w:r>
+          </w:p>
+        </w:tc>
+        <w:tc>
+          <w:tcPr>
+            <w:tcW w:w="2614" w:type="dxa"/>
+            <w:gridSpan w:val="2"/>
+          </w:tcPr>
+          <w:p>
+            <w:pPr>
+              <w:spacing w:after="0" w:line="240" w:lineRule="auto"/>
+              <w:rPr>
+                <w:b/>
+                <w:bCs/>
+              </w:rPr>
+            </w:pPr>
+            <w:r>
+              <w:rPr>
+                <w:b/>
+                <w:bCs/>
+              </w:rPr>
+              <w:t>District: __________________</w:t>
+            </w:r>
+          </w:p>
+        </w:tc>
+        <w:tc>
+          <w:tcPr>
+            <w:tcW w:w="2616" w:type="dxa"/>
+            <w:gridSpan w:val="2"/>
+          </w:tcPr>
+          <w:p>
+            <w:pPr>
+              <w:spacing w:after="0" w:line="240" w:lineRule="auto"/>
+              <w:rPr>
+                <w:b/>
+                <w:bCs/>
+              </w:rPr>
+            </w:pPr>
+            <w:r>
+              <w:rPr>
+                <w:b/>
+                <w:bCs/>
+              </w:rPr>
+              <w:t>Month &amp; Year: __________________</w:t>
+            </w:r>
+          </w:p>
+        </w:tc>
+      </w:tr>
+      <w:tr>
+        <w:tblPrEx>
+          <w:tblBorders>
+            <w:top w:val="single" w:color="auto" w:sz="4" w:space="0"/>
+            <w:left w:val="single" w:color="auto" w:sz="4" w:space="0"/>
+            <w:bottom w:val="single" w:color="auto" w:sz="4" w:space="0"/>
+            <w:right w:val="single" w:color="auto" w:sz="4" w:space="0"/>
+            <w:insideH w:val="single" w:color="auto" w:sz="4" w:space="0"/>
+            <w:insideV w:val="single" w:color="auto" w:sz="4" w:space="0"/>
+          </w:tblBorders>
+          <w:tblCellMar>
+            <w:top w:w="0" w:type="dxa"/>
+            <w:left w:w="108" w:type="dxa"/>
+            <w:bottom w:w="0" w:type="dxa"/>
+            <w:right w:w="108" w:type="dxa"/>
+          </w:tblCellMar>
+        </w:tblPrEx>
+        <w:trPr>
+          <w:gridAfter w:val="1"/>
+          <w:wAfter w:w="3" w:type="dxa"/>
+          <w:jc w:val="center"/>
+        </w:trPr>
+        <w:tc>
+          <w:tcPr>
+            <w:tcW w:w="2612" w:type="dxa"/>
+            <w:gridSpan w:val="2"/>
+          </w:tcPr>
+          <w:p>
+            <w:pPr>
+              <w:spacing w:after="0" w:line="240" w:lineRule="auto"/>
+              <w:rPr>
+                <w:b/>
+                <w:bCs/>
+              </w:rPr>
+            </w:pPr>
+            <w:r>
+              <w:rPr>
+                <w:b/>
+                <w:bCs/>
+              </w:rPr>
+              <w:t>Trainer: __________________</w:t>
+            </w:r>
+          </w:p>
+        </w:tc>
+        <w:tc>
+          <w:tcPr>
+            <w:tcW w:w="2840" w:type="dxa"/>
+            <w:gridSpan w:val="2"/>
+          </w:tcPr>
+          <w:p>
+            <w:pPr>
+              <w:spacing w:after="0" w:line="240" w:lineRule="auto"/>
+              <w:rPr>
+                <w:b/>
+                <w:bCs/>
+              </w:rPr>
+            </w:pPr>
+            <w:r>
+              <w:rPr>
+                <w:b/>
+                <w:bCs/>
+              </w:rPr>
+              <w:t>Master Trainer: __________________</w:t>
+            </w:r>
+          </w:p>
+        </w:tc>
+        <w:tc>
+          <w:tcPr>
+            <w:tcW w:w="2614" w:type="dxa"/>
+            <w:gridSpan w:val="2"/>
+            <w:shd w:val="clear"/>
+            <w:vAlign w:val="top"/>
+          </w:tcPr>
+          <w:p>
+            <w:pPr>
+              <w:rPr>
+                <w:rFonts w:asciiTheme="minorHAnsi" w:hAnsiTheme="minorHAnsi" w:eastAsiaTheme="minorEastAsia" w:cstheme="minorBidi"/>
+                <w:sz w:val="22"/>
+                <w:szCs w:val="22"/>
+                <w:lang w:val="en-US" w:eastAsia="en-US" w:bidi="ar-SA"/>
+              </w:rPr>
+            </w:pPr>
+            <w:r>
+              <w:rPr>
+                <w:b/>
+                <w:bCs/>
+                <w:sz w:val="20"/>
+                <w:szCs w:val="20"/>
+              </w:rPr>
+              <w:t xml:space="preserve">Head of Institution: </w:t>
+            </w:r>
+            <w:r>
+              <w:rPr>
+                <w:color w:val="595959"/>
+                <w:sz w:val="20"/>
+                <w:szCs w:val="20"/>
+              </w:rPr>
+              <w:t>____________________</w:t>
+            </w:r>
+          </w:p>
+        </w:tc>
+        <w:tc>
+          <w:tcPr>
+            <w:tcW w:w="2616" w:type="dxa"/>
+            <w:gridSpan w:val="2"/>
+          </w:tcPr>
+          <w:p>
+            <w:pPr>
+              <w:spacing w:after="0" w:line="240" w:lineRule="auto"/>
+              <w:rPr>
+                <w:b/>
+                <w:bCs/>
+              </w:rPr>
+            </w:pPr>
+          </w:p>
+        </w:tc>
+      </w:tr>
+      <w:tr>
+        <w:tblPrEx>
+          <w:tblBorders>
+            <w:top w:val="single" w:color="auto" w:sz="4" w:space="0"/>
+            <w:left w:val="single" w:color="auto" w:sz="4" w:space="0"/>
+            <w:bottom w:val="single" w:color="auto" w:sz="4" w:space="0"/>
+            <w:right w:val="single" w:color="auto" w:sz="4" w:space="0"/>
+            <w:insideH w:val="single" w:color="auto" w:sz="4" w:space="0"/>
+            <w:insideV w:val="single" w:color="auto" w:sz="4" w:space="0"/>
+          </w:tblBorders>
+          <w:tblCellMar>
+            <w:top w:w="0" w:type="dxa"/>
+            <w:left w:w="108" w:type="dxa"/>
+            <w:bottom w:w="0" w:type="dxa"/>
+            <w:right w:w="108" w:type="dxa"/>
+          </w:tblCellMar>
+        </w:tblPrEx>
+        <w:tc>
+          <w:tcPr>
+            <w:tcW w:w="1305" w:type="dxa"/>
+            <w:vAlign w:val="center"/>
+          </w:tcPr>
+          <w:p>
+            <w:pPr>
+              <w:spacing w:after="0" w:line="240" w:lineRule="auto"/>
+              <w:rPr>
+                <w:b/>
+                <w:bCs/>
+              </w:rPr>
+            </w:pPr>
+            <w:r>
+              <w:rPr>
+                <w:b/>
+                <w:bCs/>
+              </w:rPr>
+              <w:t>Class</w:t>
+            </w:r>
+          </w:p>
+        </w:tc>
+        <w:tc>
+          <w:tcPr>
+            <w:tcW w:w="1307" w:type="dxa"/>
+            <w:vAlign w:val="center"/>
+          </w:tcPr>
+          <w:p>
+            <w:pPr>
+              <w:spacing w:after="0" w:line="240" w:lineRule="auto"/>
+              <w:rPr>
+                <w:b/>
+                <w:bCs/>
+              </w:rPr>
+            </w:pPr>
+            <w:r>
+              <w:rPr>
+                <w:rFonts w:hint="default"/>
+                <w:b/>
+                <w:bCs/>
+                <w:lang w:val="en-US"/>
+              </w:rPr>
+              <w:t xml:space="preserve">Students </w:t>
+            </w:r>
+            <w:r>
+              <w:rPr>
+                <w:b/>
+                <w:bCs/>
+              </w:rPr>
+              <w:t>Enrolled</w:t>
+            </w:r>
+          </w:p>
+        </w:tc>
+        <w:tc>
+          <w:tcPr>
+            <w:tcW w:w="1533" w:type="dxa"/>
+            <w:vAlign w:val="center"/>
+          </w:tcPr>
+          <w:p>
+            <w:pPr>
+              <w:spacing w:after="0" w:line="240" w:lineRule="auto"/>
+              <w:jc w:val="center"/>
+              <w:rPr>
+                <w:b/>
+                <w:bCs/>
+              </w:rPr>
+            </w:pPr>
+            <w:r>
+              <w:rPr>
+                <w:rFonts w:hint="default"/>
+                <w:b/>
+                <w:bCs/>
+                <w:lang w:val="en-US"/>
+              </w:rPr>
+              <w:t xml:space="preserve">Avg. </w:t>
+            </w:r>
+            <w:r>
+              <w:rPr>
+                <w:b/>
+                <w:bCs/>
+              </w:rPr>
+              <w:t>Attendance %</w:t>
+            </w:r>
+          </w:p>
+        </w:tc>
+        <w:tc>
+          <w:tcPr>
+            <w:tcW w:w="1307" w:type="dxa"/>
+            <w:vAlign w:val="center"/>
+          </w:tcPr>
+          <w:p>
+            <w:pPr>
+              <w:spacing w:after="0" w:line="240" w:lineRule="auto"/>
+              <w:rPr>
+                <w:b/>
+                <w:bCs/>
+              </w:rPr>
+            </w:pPr>
+            <w:r>
+              <w:rPr>
+                <w:b/>
+                <w:bCs/>
+              </w:rPr>
+              <w:t>Sessions Planned</w:t>
+            </w:r>
+          </w:p>
+        </w:tc>
+        <w:tc>
+          <w:tcPr>
+            <w:tcW w:w="1309" w:type="dxa"/>
+            <w:vAlign w:val="center"/>
+          </w:tcPr>
+          <w:p>
+            <w:pPr>
+              <w:spacing w:after="0" w:line="240" w:lineRule="auto"/>
+              <w:rPr>
+                <w:b/>
+                <w:bCs/>
+              </w:rPr>
+            </w:pPr>
+            <w:r>
+              <w:rPr>
+                <w:rFonts w:hint="default"/>
+                <w:b/>
+                <w:bCs/>
+                <w:lang w:val="en-US"/>
+              </w:rPr>
+              <w:t xml:space="preserve">Sessions </w:t>
+            </w:r>
+            <w:r>
+              <w:rPr>
+                <w:b/>
+                <w:bCs/>
+              </w:rPr>
+              <w:t>Held</w:t>
+            </w:r>
+          </w:p>
+        </w:tc>
+        <w:tc>
+          <w:tcPr>
+            <w:tcW w:w="1306" w:type="dxa"/>
+            <w:vAlign w:val="center"/>
+          </w:tcPr>
+          <w:p>
+            <w:pPr>
+              <w:spacing w:after="0" w:line="240" w:lineRule="auto"/>
+              <w:rPr>
+                <w:rFonts w:hint="default"/>
+                <w:b/>
+                <w:bCs/>
+                <w:lang w:val="en-US"/>
+              </w:rPr>
+            </w:pPr>
+            <w:r>
+              <w:rPr>
+                <w:rFonts w:hint="default"/>
+                <w:b/>
+                <w:bCs/>
+                <w:lang w:val="en-US"/>
+              </w:rPr>
+              <w:t xml:space="preserve">Curriculum </w:t>
+            </w:r>
+            <w:r>
+              <w:rPr>
+                <w:b/>
+                <w:bCs/>
+              </w:rPr>
+              <w:t>Hours</w:t>
+            </w:r>
+            <w:r>
+              <w:rPr>
+                <w:rFonts w:hint="default"/>
+                <w:b/>
+                <w:bCs/>
+                <w:lang w:val="en-US"/>
+              </w:rPr>
+              <w:t xml:space="preserve"> Completed</w:t>
+            </w:r>
+          </w:p>
+        </w:tc>
+        <w:tc>
+          <w:tcPr>
+            <w:tcW w:w="1309" w:type="dxa"/>
+            <w:vAlign w:val="center"/>
+          </w:tcPr>
+          <w:p>
+            <w:pPr>
+              <w:spacing w:after="0" w:line="240" w:lineRule="auto"/>
+              <w:rPr>
+                <w:rFonts w:hint="default"/>
+                <w:b/>
+                <w:bCs/>
+                <w:lang w:val="en-US"/>
+              </w:rPr>
+            </w:pPr>
+            <w:r>
+              <w:rPr>
+                <w:b/>
+                <w:bCs/>
+              </w:rPr>
+              <w:t>Projects</w:t>
+            </w:r>
+            <w:r>
+              <w:rPr>
+                <w:rFonts w:hint="default"/>
+                <w:b/>
+                <w:bCs/>
+                <w:lang w:val="en-US"/>
+              </w:rPr>
+              <w:t xml:space="preserve"> in Progress</w:t>
+            </w:r>
+          </w:p>
+        </w:tc>
+        <w:tc>
+          <w:tcPr>
+            <w:tcW w:w="1309" w:type="dxa"/>
+            <w:gridSpan w:val="2"/>
+            <w:vAlign w:val="center"/>
+          </w:tcPr>
+          <w:p>
+            <w:pPr>
+              <w:spacing w:after="0" w:line="240" w:lineRule="auto"/>
+              <w:rPr>
+                <w:b/>
+                <w:bCs/>
+              </w:rPr>
+            </w:pPr>
+            <w:r>
+              <w:rPr>
+                <w:b/>
+                <w:bCs/>
+              </w:rPr>
+              <w:t>Remarks</w:t>
+            </w:r>
+          </w:p>
+        </w:tc>
+      </w:tr>
+      <w:tr>
+        <w:tblPrEx>
+          <w:tblBorders>
+            <w:top w:val="single" w:color="auto" w:sz="4" w:space="0"/>
+            <w:left w:val="single" w:color="auto" w:sz="4" w:space="0"/>
+            <w:bottom w:val="single" w:color="auto" w:sz="4" w:space="0"/>
+            <w:right w:val="single" w:color="auto" w:sz="4" w:space="0"/>
+            <w:insideH w:val="single" w:color="auto" w:sz="4" w:space="0"/>
+            <w:insideV w:val="single" w:color="auto" w:sz="4" w:space="0"/>
+          </w:tblBorders>
+          <w:tblCellMar>
+            <w:top w:w="0" w:type="dxa"/>
+            <w:left w:w="108" w:type="dxa"/>
+            <w:bottom w:w="0" w:type="dxa"/>
+            <w:right w:w="108" w:type="dxa"/>
+          </w:tblCellMar>
+        </w:tblPrEx>
+        <w:tc>
+          <w:tcPr>
+            <w:tcW w:w="1305" w:type="dxa"/>
+          </w:tcPr>
+          <w:p>
+            <w:pPr>
+              <w:spacing w:after="0" w:line="240" w:lineRule="auto"/>
+            </w:pPr>
+          </w:p>
+        </w:tc>
+        <w:tc>
+          <w:tcPr>
+            <w:tcW w:w="1307" w:type="dxa"/>
+          </w:tcPr>
+          <w:p>
+            <w:pPr>
+              <w:spacing w:after="0" w:line="240" w:lineRule="auto"/>
+            </w:pPr>
+          </w:p>
+        </w:tc>
+        <w:tc>
+          <w:tcPr>
+            <w:tcW w:w="1533" w:type="dxa"/>
+          </w:tcPr>
+          <w:p>
+            <w:pPr>
+              <w:spacing w:after="0" w:line="240" w:lineRule="auto"/>
+            </w:pPr>
+          </w:p>
+        </w:tc>
+        <w:tc>
+          <w:tcPr>
+            <w:tcW w:w="1307" w:type="dxa"/>
+          </w:tcPr>
+          <w:p>
+            <w:pPr>
+              <w:spacing w:after="0" w:line="240" w:lineRule="auto"/>
+            </w:pPr>
+          </w:p>
+        </w:tc>
+        <w:tc>
+          <w:tcPr>
+            <w:tcW w:w="1309" w:type="dxa"/>
+          </w:tcPr>
+          <w:p>
+            <w:pPr>
+              <w:spacing w:after="0" w:line="240" w:lineRule="auto"/>
+            </w:pPr>
+          </w:p>
+        </w:tc>
+        <w:tc>
+          <w:tcPr>
+            <w:tcW w:w="1306" w:type="dxa"/>
+          </w:tcPr>
+          <w:p>
+            <w:pPr>
+              <w:spacing w:after="0" w:line="240" w:lineRule="auto"/>
+            </w:pPr>
+          </w:p>
+        </w:tc>
+        <w:tc>
+          <w:tcPr>
+            <w:tcW w:w="1309" w:type="dxa"/>
+          </w:tcPr>
+          <w:p>
+            <w:pPr>
+              <w:spacing w:after="0" w:line="240" w:lineRule="auto"/>
+            </w:pPr>
+          </w:p>
+        </w:tc>
+        <w:tc>
+          <w:tcPr>
+            <w:tcW w:w="1309" w:type="dxa"/>
+            <w:gridSpan w:val="2"/>
+          </w:tcPr>
+          <w:p>
+            <w:pPr>
+              <w:spacing w:after="0" w:line="240" w:lineRule="auto"/>
+            </w:pPr>
+          </w:p>
+        </w:tc>
+      </w:tr>
+      <w:tr>
+        <w:tblPrEx>
+          <w:tblBorders>
+            <w:top w:val="single" w:color="auto" w:sz="4" w:space="0"/>
+            <w:left w:val="single" w:color="auto" w:sz="4" w:space="0"/>
+            <w:bottom w:val="single" w:color="auto" w:sz="4" w:space="0"/>
+            <w:right w:val="single" w:color="auto" w:sz="4" w:space="0"/>
+            <w:insideH w:val="single" w:color="auto" w:sz="4" w:space="0"/>
+            <w:insideV w:val="single" w:color="auto" w:sz="4" w:space="0"/>
+          </w:tblBorders>
+          <w:tblCellMar>
+            <w:top w:w="0" w:type="dxa"/>
+            <w:left w:w="108" w:type="dxa"/>
+            <w:bottom w:w="0" w:type="dxa"/>
+            <w:right w:w="108" w:type="dxa"/>
+          </w:tblCellMar>
+        </w:tblPrEx>
+        <w:tc>
+          <w:tcPr>
+            <w:tcW w:w="1305" w:type="dxa"/>
+          </w:tcPr>
+          <w:p>
+            <w:pPr>
+              <w:spacing w:after="0" w:line="240" w:lineRule="auto"/>
+            </w:pPr>
+          </w:p>
+        </w:tc>
+        <w:tc>
+          <w:tcPr>
+            <w:tcW w:w="1307" w:type="dxa"/>
+          </w:tcPr>
+          <w:p>
+            <w:pPr>
+              <w:spacing w:after="0" w:line="240" w:lineRule="auto"/>
+            </w:pPr>
+          </w:p>
+        </w:tc>
+        <w:tc>
+          <w:tcPr>
+            <w:tcW w:w="1533" w:type="dxa"/>
+          </w:tcPr>
+          <w:p>
+            <w:pPr>
+              <w:spacing w:after="0" w:line="240" w:lineRule="auto"/>
+            </w:pPr>
+          </w:p>
+        </w:tc>
+        <w:tc>
+          <w:tcPr>
+            <w:tcW w:w="1307" w:type="dxa"/>
+          </w:tcPr>
+          <w:p>
+            <w:pPr>
+              <w:spacing w:after="0" w:line="240" w:lineRule="auto"/>
+            </w:pPr>
+          </w:p>
+        </w:tc>
+        <w:tc>
+          <w:tcPr>
+            <w:tcW w:w="1309" w:type="dxa"/>
+          </w:tcPr>
+          <w:p>
+            <w:pPr>
+              <w:spacing w:after="0" w:line="240" w:lineRule="auto"/>
+            </w:pPr>
+          </w:p>
+        </w:tc>
+        <w:tc>
+          <w:tcPr>
+            <w:tcW w:w="1306" w:type="dxa"/>
+          </w:tcPr>
+          <w:p>
+            <w:pPr>
+              <w:spacing w:after="0" w:line="240" w:lineRule="auto"/>
+            </w:pPr>
+          </w:p>
+        </w:tc>
+        <w:tc>
+          <w:tcPr>
+            <w:tcW w:w="1309" w:type="dxa"/>
+          </w:tcPr>
+          <w:p>
+            <w:pPr>
+              <w:spacing w:after="0" w:line="240" w:lineRule="auto"/>
+            </w:pPr>
+          </w:p>
+        </w:tc>
+        <w:tc>
+          <w:tcPr>
+            <w:tcW w:w="1309" w:type="dxa"/>
+            <w:gridSpan w:val="2"/>
+          </w:tcPr>
+          <w:p>
+            <w:pPr>
+              <w:spacing w:after="0" w:line="240" w:lineRule="auto"/>
+            </w:pPr>
+          </w:p>
+        </w:tc>
+      </w:tr>
+      <w:tr>
+        <w:tblPrEx>
+          <w:tblBorders>
+            <w:top w:val="single" w:color="auto" w:sz="4" w:space="0"/>
+            <w:left w:val="single" w:color="auto" w:sz="4" w:space="0"/>
+            <w:bottom w:val="single" w:color="auto" w:sz="4" w:space="0"/>
+            <w:right w:val="single" w:color="auto" w:sz="4" w:space="0"/>
+            <w:insideH w:val="single" w:color="auto" w:sz="4" w:space="0"/>
+            <w:insideV w:val="single" w:color="auto" w:sz="4" w:space="0"/>
+          </w:tblBorders>
+          <w:tblCellMar>
+            <w:top w:w="0" w:type="dxa"/>
+            <w:left w:w="108" w:type="dxa"/>
+            <w:bottom w:w="0" w:type="dxa"/>
+            <w:right w:w="108" w:type="dxa"/>
+          </w:tblCellMar>
+        </w:tblPrEx>
+        <w:tc>
+          <w:tcPr>
+            <w:tcW w:w="1305" w:type="dxa"/>
+          </w:tcPr>
+          <w:p>
+            <w:pPr>
+              <w:spacing w:after="0" w:line="240" w:lineRule="auto"/>
+            </w:pPr>
+          </w:p>
+        </w:tc>
+        <w:tc>
+          <w:tcPr>
+            <w:tcW w:w="1307" w:type="dxa"/>
+          </w:tcPr>
+          <w:p>
+            <w:pPr>
+              <w:spacing w:after="0" w:line="240" w:lineRule="auto"/>
+            </w:pPr>
+          </w:p>
+        </w:tc>
+        <w:tc>
+          <w:tcPr>
+            <w:tcW w:w="1533" w:type="dxa"/>
+          </w:tcPr>
+          <w:p>
+            <w:pPr>
+              <w:spacing w:after="0" w:line="240" w:lineRule="auto"/>
+            </w:pPr>
+          </w:p>
+        </w:tc>
+        <w:tc>
+          <w:tcPr>
+            <w:tcW w:w="1307" w:type="dxa"/>
+          </w:tcPr>
+          <w:p>
+            <w:pPr>
+              <w:spacing w:after="0" w:line="240" w:lineRule="auto"/>
+            </w:pPr>
+          </w:p>
+        </w:tc>
+        <w:tc>
+          <w:tcPr>
+            <w:tcW w:w="1309" w:type="dxa"/>
+          </w:tcPr>
+          <w:p>
+            <w:pPr>
+              <w:spacing w:after="0" w:line="240" w:lineRule="auto"/>
+            </w:pPr>
+          </w:p>
+        </w:tc>
+        <w:tc>
+          <w:tcPr>
+            <w:tcW w:w="1306" w:type="dxa"/>
+          </w:tcPr>
+          <w:p>
+            <w:pPr>
+              <w:spacing w:after="0" w:line="240" w:lineRule="auto"/>
+            </w:pPr>
+          </w:p>
+        </w:tc>
+        <w:tc>
+          <w:tcPr>
+            <w:tcW w:w="1309" w:type="dxa"/>
+          </w:tcPr>
+          <w:p>
+            <w:pPr>
+              <w:spacing w:after="0" w:line="240" w:lineRule="auto"/>
+            </w:pPr>
+          </w:p>
+        </w:tc>
+        <w:tc>
+          <w:tcPr>
+            <w:tcW w:w="1309" w:type="dxa"/>
+            <w:gridSpan w:val="2"/>
+          </w:tcPr>
+          <w:p>
+            <w:pPr>
+              <w:spacing w:after="0" w:line="240" w:lineRule="auto"/>
+            </w:pPr>
+          </w:p>
+        </w:tc>
+      </w:tr>
+      <w:tr>
+        <w:tblPrEx>
+          <w:tblBorders>
+            <w:top w:val="single" w:color="auto" w:sz="4" w:space="0"/>
+            <w:left w:val="single" w:color="auto" w:sz="4" w:space="0"/>
+            <w:bottom w:val="single" w:color="auto" w:sz="4" w:space="0"/>
+            <w:right w:val="single" w:color="auto" w:sz="4" w:space="0"/>
+            <w:insideH w:val="single" w:color="auto" w:sz="4" w:space="0"/>
+            <w:insideV w:val="single" w:color="auto" w:sz="4" w:space="0"/>
+          </w:tblBorders>
+          <w:tblCellMar>
+            <w:top w:w="0" w:type="dxa"/>
+            <w:left w:w="108" w:type="dxa"/>
+            <w:bottom w:w="0" w:type="dxa"/>
+            <w:right w:w="108" w:type="dxa"/>
+          </w:tblCellMar>
+        </w:tblPrEx>
+        <w:tc>
+          <w:tcPr>
+            <w:tcW w:w="1305" w:type="dxa"/>
+          </w:tcPr>
+          <w:p>
+            <w:pPr>
+              <w:spacing w:after="0" w:line="240" w:lineRule="auto"/>
+            </w:pPr>
+          </w:p>
+        </w:tc>
+        <w:tc>
+          <w:tcPr>
+            <w:tcW w:w="1307" w:type="dxa"/>
+          </w:tcPr>
+          <w:p>
+            <w:pPr>
+              <w:spacing w:after="0" w:line="240" w:lineRule="auto"/>
+            </w:pPr>
+          </w:p>
+        </w:tc>
+        <w:tc>
+          <w:tcPr>
+            <w:tcW w:w="1533" w:type="dxa"/>
+          </w:tcPr>
+          <w:p>
+            <w:pPr>
+              <w:spacing w:after="0" w:line="240" w:lineRule="auto"/>
+            </w:pPr>
+          </w:p>
+        </w:tc>
+        <w:tc>
+          <w:tcPr>
+            <w:tcW w:w="1307" w:type="dxa"/>
+          </w:tcPr>
+          <w:p>
+            <w:pPr>
+              <w:spacing w:after="0" w:line="240" w:lineRule="auto"/>
+            </w:pPr>
+          </w:p>
+        </w:tc>
+        <w:tc>
+          <w:tcPr>
+            <w:tcW w:w="1309" w:type="dxa"/>
+          </w:tcPr>
+          <w:p>
+            <w:pPr>
+              <w:spacing w:after="0" w:line="240" w:lineRule="auto"/>
+            </w:pPr>
+          </w:p>
+        </w:tc>
+        <w:tc>
+          <w:tcPr>
+            <w:tcW w:w="1306" w:type="dxa"/>
+          </w:tcPr>
+          <w:p>
+            <w:pPr>
+              <w:spacing w:after="0" w:line="240" w:lineRule="auto"/>
+            </w:pPr>
+          </w:p>
+        </w:tc>
+        <w:tc>
+          <w:tcPr>
+            <w:tcW w:w="1309" w:type="dxa"/>
+          </w:tcPr>
+          <w:p>
+            <w:pPr>
+              <w:spacing w:after="0" w:line="240" w:lineRule="auto"/>
+            </w:pPr>
+          </w:p>
+        </w:tc>
+        <w:tc>
+          <w:tcPr>
+            <w:tcW w:w="1309" w:type="dxa"/>
+            <w:gridSpan w:val="2"/>
+          </w:tcPr>
+          <w:p>
+            <w:pPr>
+              <w:spacing w:after="0" w:line="240" w:lineRule="auto"/>
+            </w:pPr>
+          </w:p>
+        </w:tc>
+      </w:tr>
+      <w:tr>
+        <w:tblPrEx>
+          <w:tblBorders>
+            <w:top w:val="single" w:color="auto" w:sz="4" w:space="0"/>
+            <w:left w:val="single" w:color="auto" w:sz="4" w:space="0"/>
+            <w:bottom w:val="single" w:color="auto" w:sz="4" w:space="0"/>
+            <w:right w:val="single" w:color="auto" w:sz="4" w:space="0"/>
+            <w:insideH w:val="single" w:color="auto" w:sz="4" w:space="0"/>
+            <w:insideV w:val="single" w:color="auto" w:sz="4" w:space="0"/>
+          </w:tblBorders>
+          <w:tblCellMar>
+            <w:top w:w="0" w:type="dxa"/>
+            <w:left w:w="108" w:type="dxa"/>
+            <w:bottom w:w="0" w:type="dxa"/>
+            <w:right w:w="108" w:type="dxa"/>
+          </w:tblCellMar>
+        </w:tblPrEx>
+        <w:tc>
+          <w:tcPr>
+            <w:tcW w:w="1305" w:type="dxa"/>
+          </w:tcPr>
+          <w:p>
+            <w:pPr>
+              <w:spacing w:after="0" w:line="240" w:lineRule="auto"/>
+            </w:pPr>
+          </w:p>
+        </w:tc>
+        <w:tc>
+          <w:tcPr>
+            <w:tcW w:w="1307" w:type="dxa"/>
+          </w:tcPr>
+          <w:p>
+            <w:pPr>
+              <w:spacing w:after="0" w:line="240" w:lineRule="auto"/>
+            </w:pPr>
+          </w:p>
+        </w:tc>
+        <w:tc>
+          <w:tcPr>
+            <w:tcW w:w="1533" w:type="dxa"/>
+          </w:tcPr>
+          <w:p>
+            <w:pPr>
+              <w:spacing w:after="0" w:line="240" w:lineRule="auto"/>
+            </w:pPr>
+          </w:p>
+        </w:tc>
+        <w:tc>
+          <w:tcPr>
+            <w:tcW w:w="1307" w:type="dxa"/>
+          </w:tcPr>
+          <w:p>
+            <w:pPr>
+              <w:spacing w:after="0" w:line="240" w:lineRule="auto"/>
+            </w:pPr>
+          </w:p>
+        </w:tc>
+        <w:tc>
+          <w:tcPr>
+            <w:tcW w:w="1309" w:type="dxa"/>
+          </w:tcPr>
+          <w:p>
+            <w:pPr>
+              <w:spacing w:after="0" w:line="240" w:lineRule="auto"/>
+            </w:pPr>
+          </w:p>
+        </w:tc>
+        <w:tc>
+          <w:tcPr>
+            <w:tcW w:w="1306" w:type="dxa"/>
+          </w:tcPr>
+          <w:p>
+            <w:pPr>
+              <w:spacing w:after="0" w:line="240" w:lineRule="auto"/>
+            </w:pPr>
+          </w:p>
+        </w:tc>
+        <w:tc>
+          <w:tcPr>
+            <w:tcW w:w="1309" w:type="dxa"/>
+          </w:tcPr>
+          <w:p>
+            <w:pPr>
+              <w:spacing w:after="0" w:line="240" w:lineRule="auto"/>
+            </w:pPr>
+          </w:p>
+        </w:tc>
+        <w:tc>
+          <w:tcPr>
+            <w:tcW w:w="1309" w:type="dxa"/>
+            <w:gridSpan w:val="2"/>
+          </w:tcPr>
+          <w:p>
+            <w:pPr>
+              <w:spacing w:after="0" w:line="240" w:lineRule="auto"/>
+            </w:pPr>
+          </w:p>
+        </w:tc>
+      </w:tr>
+      <w:tr>
+        <w:tblPrEx>
+          <w:tblBorders>
+            <w:top w:val="single" w:color="auto" w:sz="4" w:space="0"/>
+            <w:left w:val="single" w:color="auto" w:sz="4" w:space="0"/>
+            <w:bottom w:val="single" w:color="auto" w:sz="4" w:space="0"/>
+            <w:right w:val="single" w:color="auto" w:sz="4" w:space="0"/>
+            <w:insideH w:val="single" w:color="auto" w:sz="4" w:space="0"/>
+            <w:insideV w:val="single" w:color="auto" w:sz="4" w:space="0"/>
+          </w:tblBorders>
+          <w:tblCellMar>
+            <w:top w:w="0" w:type="dxa"/>
+            <w:left w:w="108" w:type="dxa"/>
+            <w:bottom w:w="0" w:type="dxa"/>
+            <w:right w:w="108" w:type="dxa"/>
+          </w:tblCellMar>
+        </w:tblPrEx>
+        <w:tc>
+          <w:tcPr>
+            <w:tcW w:w="1305" w:type="dxa"/>
+          </w:tcPr>
+          <w:p>
+            <w:pPr>
+              <w:spacing w:after="0" w:line="240" w:lineRule="auto"/>
+            </w:pPr>
+          </w:p>
+        </w:tc>
+        <w:tc>
+          <w:tcPr>
+            <w:tcW w:w="1307" w:type="dxa"/>
+          </w:tcPr>
+          <w:p>
+            <w:pPr>
+              <w:spacing w:after="0" w:line="240" w:lineRule="auto"/>
+            </w:pPr>
+          </w:p>
+        </w:tc>
+        <w:tc>
+          <w:tcPr>
+            <w:tcW w:w="1533" w:type="dxa"/>
+          </w:tcPr>
+          <w:p>
+            <w:pPr>
+              <w:spacing w:after="0" w:line="240" w:lineRule="auto"/>
+            </w:pPr>
+          </w:p>
+        </w:tc>
+        <w:tc>
+          <w:tcPr>
+            <w:tcW w:w="1307" w:type="dxa"/>
+          </w:tcPr>
+          <w:p>
+            <w:pPr>
+              <w:spacing w:after="0" w:line="240" w:lineRule="auto"/>
+            </w:pPr>
+          </w:p>
+        </w:tc>
+        <w:tc>
+          <w:tcPr>
+            <w:tcW w:w="1309" w:type="dxa"/>
+          </w:tcPr>
+          <w:p>
+            <w:pPr>
+              <w:spacing w:after="0" w:line="240" w:lineRule="auto"/>
+            </w:pPr>
+          </w:p>
+        </w:tc>
+        <w:tc>
+          <w:tcPr>
+            <w:tcW w:w="1306" w:type="dxa"/>
+          </w:tcPr>
+          <w:p>
+            <w:pPr>
+              <w:spacing w:after="0" w:line="240" w:lineRule="auto"/>
+            </w:pPr>
+          </w:p>
+        </w:tc>
+        <w:tc>
+          <w:tcPr>
+            <w:tcW w:w="1309" w:type="dxa"/>
+          </w:tcPr>
+          <w:p>
+            <w:pPr>
+              <w:spacing w:after="0" w:line="240" w:lineRule="auto"/>
+            </w:pPr>
+          </w:p>
+        </w:tc>
+        <w:tc>
+          <w:tcPr>
+            <w:tcW w:w="1309" w:type="dxa"/>
+            <w:gridSpan w:val="2"/>
+          </w:tcPr>
+          <w:p>
+            <w:pPr>
+              <w:spacing w:after="0" w:line="240" w:lineRule="auto"/>
+            </w:pPr>
+          </w:p>
+        </w:tc>
+      </w:tr>
+    </w:tbl>
+    <w:p/>
+    <w:p/>
+    <w:tbl>
+      <w:tblPr>
+        <w:tblStyle w:val="12"/>
+        <w:tblW w:w="10708" w:type="dxa"/>
+        <w:tblInd w:w="-58" w:type="dxa"/>
+        <w:tblBorders>
+          <w:top w:val="single" w:color="auto" w:sz="4" w:space="0"/>
+          <w:left w:val="single" w:color="auto" w:sz="4" w:space="0"/>
+          <w:bottom w:val="single" w:color="auto" w:sz="4" w:space="0"/>
+          <w:right w:val="single" w:color="auto" w:sz="4" w:space="0"/>
+          <w:insideH w:val="single" w:color="auto" w:sz="4" w:space="0"/>
+          <w:insideV w:val="single" w:color="auto" w:sz="4" w:space="0"/>
+        </w:tblBorders>
+        <w:tblLayout w:type="autofit"/>
+        <w:tblCellMar>
+          <w:top w:w="0" w:type="dxa"/>
+          <w:left w:w="10" w:type="dxa"/>
+          <w:bottom w:w="0" w:type="dxa"/>
+          <w:right w:w="10" w:type="dxa"/>
+        </w:tblCellMar>
+      </w:tblPr>
+      <w:tblGrid>
+        <w:gridCol w:w="5465"/>
+        <w:gridCol w:w="5243"/>
+      </w:tblGrid>
+      <w:tr>
+        <w:tblPrEx>
+          <w:tblBorders>
+            <w:top w:val="single" w:color="auto" w:sz="4" w:space="0"/>
+            <w:left w:val="single" w:color="auto" w:sz="4" w:space="0"/>
+            <w:bottom w:val="single" w:color="auto" w:sz="4" w:space="0"/>
+            <w:right w:val="single" w:color="auto" w:sz="4" w:space="0"/>
+            <w:insideH w:val="single" w:color="auto" w:sz="4" w:space="0"/>
+            <w:insideV w:val="single" w:color="auto" w:sz="4" w:space="0"/>
+          </w:tblBorders>
+          <w:tblCellMar>
+            <w:top w:w="0" w:type="dxa"/>
+            <w:left w:w="10" w:type="dxa"/>
+            <w:bottom w:w="0" w:type="dxa"/>
+            <w:right w:w="10" w:type="dxa"/>
+          </w:tblCellMar>
+        </w:tblPrEx>
+        <w:trPr>
+          <w:tblHeader/>
+        </w:trPr>
+        <w:tc>
+          <w:tcPr>
+            <w:tcW w:w="5465" w:type="dxa"/>
+            <w:shd w:val="clear" w:color="auto" w:fill="D9E2F3"/>
+            <w:tcMar>
+              <w:top w:w="50" w:type="dxa"/>
+              <w:left w:w="80" w:type="dxa"/>
+              <w:bottom w:w="50" w:type="dxa"/>
+              <w:right w:w="80" w:type="dxa"/>
+            </w:tcMar>
+            <w:vAlign w:val="center"/>
+          </w:tcPr>
+          <w:p>
+            <w:pPr>
+              <w:jc w:val="center"/>
+              <w:rPr>
+                <w:rFonts w:hint="default"/>
+                <w:lang w:val="en-US"/>
+              </w:rPr>
+            </w:pPr>
+            <w:r>
+              <w:rPr>
+                <w:b/>
+                <w:bCs/>
+                <w:sz w:val="19"/>
+                <w:szCs w:val="19"/>
+              </w:rPr>
+              <w:t>Key Activities This Month (visits, competitions, ToT, maintenance</w:t>
+            </w:r>
+            <w:r>
+              <w:rPr>
+                <w:rFonts w:hint="default"/>
+                <w:b/>
+                <w:bCs/>
+                <w:sz w:val="19"/>
+                <w:szCs w:val="19"/>
+                <w:lang w:val="en-US"/>
+              </w:rPr>
+              <w:t>)</w:t>
+            </w:r>
+          </w:p>
+        </w:tc>
+        <w:tc>
+          <w:tcPr>
+            <w:tcW w:w="5243" w:type="dxa"/>
+            <w:shd w:val="clear" w:color="auto" w:fill="D9E2F3"/>
+            <w:tcMar>
+              <w:top w:w="50" w:type="dxa"/>
+              <w:left w:w="80" w:type="dxa"/>
+              <w:bottom w:w="50" w:type="dxa"/>
+              <w:right w:w="80" w:type="dxa"/>
+            </w:tcMar>
+            <w:vAlign w:val="center"/>
+          </w:tcPr>
+          <w:p>
+            <w:pPr>
+              <w:jc w:val="center"/>
+            </w:pPr>
+            <w:r>
+              <w:rPr>
+                <w:b/>
+                <w:bCs/>
+                <w:sz w:val="19"/>
+                <w:szCs w:val="19"/>
+              </w:rPr>
+              <w:t>Issues / Support Required</w:t>
+            </w:r>
+          </w:p>
+        </w:tc>
+      </w:tr>
+      <w:tr>
+        <w:tblPrEx>
+          <w:tblBorders>
+            <w:top w:val="single" w:color="auto" w:sz="4" w:space="0"/>
+            <w:left w:val="single" w:color="auto" w:sz="4" w:space="0"/>
+            <w:bottom w:val="single" w:color="auto" w:sz="4" w:space="0"/>
+            <w:right w:val="single" w:color="auto" w:sz="4" w:space="0"/>
+            <w:insideH w:val="single" w:color="auto" w:sz="4" w:space="0"/>
+            <w:insideV w:val="single" w:color="auto" w:sz="4" w:space="0"/>
+          </w:tblBorders>
+          <w:tblCellMar>
+            <w:top w:w="0" w:type="dxa"/>
+            <w:left w:w="10" w:type="dxa"/>
+            <w:bottom w:w="0" w:type="dxa"/>
+            <w:right w:w="10" w:type="dxa"/>
+          </w:tblCellMar>
+        </w:tblPrEx>
+        <w:trPr>
+          <w:trHeight w:val="360" w:hRule="atLeast"/>
+        </w:trPr>
+        <w:tc>
+          <w:tcPr>
+            <w:tcW w:w="5465" w:type="dxa"/>
+          </w:tcPr>
+          <w:p/>
+        </w:tc>
+        <w:tc>
+          <w:tcPr>
+            <w:tcW w:w="5243" w:type="dxa"/>
+          </w:tcPr>
+          <w:p/>
+        </w:tc>
+      </w:tr>
+      <w:tr>
+        <w:tblPrEx>
+          <w:tblBorders>
+            <w:top w:val="single" w:color="auto" w:sz="4" w:space="0"/>
+            <w:left w:val="single" w:color="auto" w:sz="4" w:space="0"/>
+            <w:bottom w:val="single" w:color="auto" w:sz="4" w:space="0"/>
+            <w:right w:val="single" w:color="auto" w:sz="4" w:space="0"/>
+            <w:insideH w:val="single" w:color="auto" w:sz="4" w:space="0"/>
+            <w:insideV w:val="single" w:color="auto" w:sz="4" w:space="0"/>
+          </w:tblBorders>
+          <w:tblCellMar>
+            <w:top w:w="0" w:type="dxa"/>
+            <w:left w:w="10" w:type="dxa"/>
+            <w:bottom w:w="0" w:type="dxa"/>
+            <w:right w:w="10" w:type="dxa"/>
+          </w:tblCellMar>
+        </w:tblPrEx>
+        <w:trPr>
+          <w:trHeight w:val="360" w:hRule="atLeast"/>
+        </w:trPr>
+        <w:tc>
+          <w:tcPr>
+            <w:tcW w:w="5465" w:type="dxa"/>
+          </w:tcPr>
+          <w:p/>
+        </w:tc>
+        <w:tc>
+          <w:tcPr>
+            <w:tcW w:w="5243" w:type="dxa"/>
+          </w:tcPr>
+          <w:p/>
+        </w:tc>
+      </w:tr>
+      <w:tr>
+        <w:tblPrEx>
+          <w:tblBorders>
+            <w:top w:val="single" w:color="auto" w:sz="4" w:space="0"/>
+            <w:left w:val="single" w:color="auto" w:sz="4" w:space="0"/>
+            <w:bottom w:val="single" w:color="auto" w:sz="4" w:space="0"/>
+            <w:right w:val="single" w:color="auto" w:sz="4" w:space="0"/>
+            <w:insideH w:val="single" w:color="auto" w:sz="4" w:space="0"/>
+            <w:insideV w:val="single" w:color="auto" w:sz="4" w:space="0"/>
+          </w:tblBorders>
+          <w:tblCellMar>
+            <w:top w:w="0" w:type="dxa"/>
+            <w:left w:w="10" w:type="dxa"/>
+            <w:bottom w:w="0" w:type="dxa"/>
+            <w:right w:w="10" w:type="dxa"/>
+          </w:tblCellMar>
+        </w:tblPrEx>
+        <w:trPr>
+          <w:trHeight w:val="360" w:hRule="atLeast"/>
+        </w:trPr>
+        <w:tc>
+          <w:tcPr>
+            <w:tcW w:w="5465" w:type="dxa"/>
+          </w:tcPr>
+          <w:p/>
+        </w:tc>
+        <w:tc>
+          <w:tcPr>
+            <w:tcW w:w="5243" w:type="dxa"/>
+          </w:tcPr>
+          <w:p/>
+        </w:tc>
+      </w:tr>
+    </w:tbl>
+    <w:p>
+      <w:pPr>
+        <w:spacing w:before="80" w:after="120"/>
+      </w:pPr>
+      <w:r>
+        <w:rPr>
+          <w:i/>
+          <w:iCs/>
+          <w:color w:val="595959"/>
+          <w:sz w:val="19"/>
+          <w:szCs w:val="19"/>
+        </w:rPr>
+        <w:t>Note: Attach attested attendance sheets (MER-03) and daily diary extracts. Submit to GTTC PMU by the 5th of the succeeding month.</w:t>
+      </w:r>
+    </w:p>
+    <w:p/>
+    <w:tbl>
+      <w:tblPr>
+        <w:tblStyle w:val="12"/>
+        <w:tblW w:w="10645" w:type="dxa"/>
+        <w:tblInd w:w="-75" w:type="dxa"/>
+        <w:tblLayout w:type="autofit"/>
+        <w:tblCellMar>
+          <w:top w:w="0" w:type="dxa"/>
+          <w:left w:w="10" w:type="dxa"/>
+          <w:bottom w:w="0" w:type="dxa"/>
+          <w:right w:w="10" w:type="dxa"/>
+        </w:tblCellMar>
+      </w:tblPr>
+      <w:tblGrid>
+        <w:gridCol w:w="5410"/>
+        <w:gridCol w:w="5235"/>
+      </w:tblGrid>
+      <w:tr>
+        <w:tblPrEx>
+          <w:tblCellMar>
+            <w:top w:w="0" w:type="dxa"/>
+            <w:left w:w="10" w:type="dxa"/>
+            <w:bottom w:w="0" w:type="dxa"/>
+            <w:right w:w="10" w:type="dxa"/>
+          </w:tblCellMar>
+        </w:tblPrEx>
+        <w:tc>
+          <w:tcPr>
+            <w:tcW w:w="5410" w:type="dxa"/>
+          </w:tcPr>
+          <w:p>
+            <w:pPr>
+              <w:spacing w:before="500"/>
+              <w:jc w:val="center"/>
+            </w:pPr>
+            <w:r>
+              <w:rPr>
+                <w:sz w:val="20"/>
+                <w:szCs w:val="20"/>
+              </w:rPr>
+              <w:t>____________________________</w:t>
+            </w:r>
+          </w:p>
+          <w:p>
+            <w:pPr>
+              <w:jc w:val="center"/>
+            </w:pPr>
+            <w:r>
+              <w:rPr>
+                <w:b/>
+                <w:bCs/>
+                <w:sz w:val="20"/>
+                <w:szCs w:val="20"/>
+              </w:rPr>
+              <w:t>ATL Trainer</w:t>
+            </w:r>
+          </w:p>
+          <w:p>
+            <w:pPr>
+              <w:jc w:val="center"/>
+            </w:pPr>
+            <w:r>
+              <w:rPr>
+                <w:color w:val="595959"/>
+                <w:sz w:val="18"/>
+                <w:szCs w:val="18"/>
+              </w:rPr>
+              <w:t>Name / Designation / Date &amp; Seal</w:t>
+            </w:r>
+          </w:p>
+        </w:tc>
+        <w:tc>
+          <w:tcPr>
+            <w:tcW w:w="5235" w:type="dxa"/>
+          </w:tcPr>
+          <w:p>
+            <w:pPr>
+              <w:spacing w:before="500"/>
+              <w:jc w:val="center"/>
+            </w:pPr>
+            <w:r>
+              <w:rPr>
+                <w:sz w:val="20"/>
+                <w:szCs w:val="20"/>
+              </w:rPr>
+              <w:t>____________________________</w:t>
+            </w:r>
+          </w:p>
+          <w:p>
+            <w:pPr>
+              <w:jc w:val="center"/>
+            </w:pPr>
+            <w:r>
+              <w:rPr>
+                <w:b/>
+                <w:bCs/>
+                <w:sz w:val="20"/>
+                <w:szCs w:val="20"/>
+              </w:rPr>
+              <w:t>Head of Institution (Attestation)</w:t>
+            </w:r>
+          </w:p>
+          <w:p>
+            <w:pPr>
+              <w:jc w:val="center"/>
+            </w:pPr>
+            <w:r>
+              <w:rPr>
+                <w:color w:val="595959"/>
+                <w:sz w:val="18"/>
+                <w:szCs w:val="18"/>
+              </w:rPr>
+              <w:t>Name / Designation / Date &amp; Seal</w:t>
+            </w:r>
+          </w:p>
+        </w:tc>
+      </w:tr>
+    </w:tbl>
+    <w:p/>
+    <w:p>
+      <w:r>
+        <w:br w:type="page"/>
+      </w:r>
+    </w:p>
+    <w:sectPr>
+      <w:pgSz w:w="11909" w:h="16834"/>
+      <w:pgMar w:top="720" w:right="720" w:bottom="720" w:left="720" w:header="720" w:footer="720" w:gutter="0"/>
+      <w:cols w:space="720" w:num="1"/>
+      <w:docGrid w:linePitch="360" w:charSpace="0"/>
+    </w:sectPr>
+  </w:body>
+</w:document>
 </file>
 
 <file path=word/endnotes.xml><?xml version="1.0" encoding="utf-8"?>

</xml_diff>